<commit_message>
updated as of 13-05-2026
</commit_message>
<xml_diff>
--- a/JavaBackendDev_ChandraSekhar_3YOE.docx
+++ b/JavaBackendDev_ChandraSekhar_3YOE.docx
@@ -6,10 +6,234 @@
       <w:pPr>
         <w:spacing w:line="240" w:lineRule="auto"/>
         <w:rPr>
+          <w:b/>
+          <w:bCs/>
+          <w:sz w:val="22"/>
+          <w:szCs w:val="22"/>
+        </w:rPr>
+      </w:pPr>
+      <w:r>
+        <w:rPr>
+          <w:b/>
+          <w:bCs/>
+          <w:sz w:val="32"/>
+          <w:szCs w:val="32"/>
+          <w:lang w:val="it-IT"/>
+        </w:rPr>
+        <w:t>CHANDRA SEKHAR VIPPARLA</w:t>
+      </w:r>
+      <w:r>
+        <w:rPr>
+          <w:b/>
+          <w:bCs/>
+          <w:sz w:val="40"/>
+          <w:szCs w:val="40"/>
+          <w:lang w:val="it-IT"/>
+        </w:rPr>
+        <w:br/>
+      </w:r>
+      <w:r>
+        <w:rPr>
           <w:rFonts w:cstheme="minorHAnsi"/>
-          <w:sz w:val="21"/>
-          <w:szCs w:val="21"/>
+          <w:sz w:val="20"/>
+          <w:szCs w:val="20"/>
           <w:lang w:val="it-IT"/>
+        </w:rPr>
+        <w:t xml:space="preserve">+91-9573145753 | </w:t>
+      </w:r>
+      <w:r>
+        <w:fldChar w:fldCharType="begin"/>
+      </w:r>
+      <w:r>
+        <w:rPr>
+          <w:lang w:val="it-IT"/>
+        </w:rPr>
+        <w:instrText>HYPERLINK "mailto:vipparlachandrasekhar@gmail.com"</w:instrText>
+      </w:r>
+      <w:r>
+        <w:fldChar w:fldCharType="separate"/>
+      </w:r>
+      <w:r>
+        <w:rPr>
+          <w:rStyle w:val="Hyperlink"/>
+          <w:rFonts w:cstheme="minorHAnsi"/>
+          <w:sz w:val="20"/>
+          <w:szCs w:val="20"/>
+          <w:lang w:val="it-IT"/>
+        </w:rPr>
+        <w:t>vipparlachandrasekhar@gmail.com</w:t>
+      </w:r>
+      <w:r>
+        <w:fldChar w:fldCharType="end"/>
+      </w:r>
+      <w:r>
+        <w:rPr>
+          <w:rFonts w:cstheme="minorHAnsi"/>
+          <w:sz w:val="20"/>
+          <w:szCs w:val="20"/>
+          <w:lang w:val="it-IT"/>
+        </w:rPr>
+        <w:t xml:space="preserve"> | </w:t>
+      </w:r>
+      <w:r>
+        <w:fldChar w:fldCharType="begin"/>
+      </w:r>
+      <w:r>
+        <w:rPr>
+          <w:lang w:val="it-IT"/>
+        </w:rPr>
+        <w:instrText>HYPERLINK "https://www.linkedin.com/in/chandra-sekhar-vipparla/"</w:instrText>
+      </w:r>
+      <w:r>
+        <w:fldChar w:fldCharType="separate"/>
+      </w:r>
+      <w:r>
+        <w:rPr>
+          <w:rStyle w:val="Hyperlink"/>
+          <w:rFonts w:cstheme="minorHAnsi"/>
+          <w:sz w:val="20"/>
+          <w:szCs w:val="20"/>
+          <w:lang w:val="it-IT"/>
+        </w:rPr>
+        <w:t>LinkedIn</w:t>
+      </w:r>
+      <w:r>
+        <w:fldChar w:fldCharType="end"/>
+      </w:r>
+      <w:r>
+        <w:rPr>
+          <w:rFonts w:cstheme="minorHAnsi"/>
+          <w:sz w:val="20"/>
+          <w:szCs w:val="20"/>
+          <w:lang w:val="it-IT"/>
+        </w:rPr>
+        <w:t xml:space="preserve"> | </w:t>
+      </w:r>
+      <w:r>
+        <w:fldChar w:fldCharType="begin"/>
+      </w:r>
+      <w:r>
+        <w:rPr>
+          <w:lang w:val="it-IT"/>
+        </w:rPr>
+        <w:instrText>HYPERLINK "https://github.com/codeWithVCS"</w:instrText>
+      </w:r>
+      <w:r>
+        <w:fldChar w:fldCharType="separate"/>
+      </w:r>
+      <w:r>
+        <w:rPr>
+          <w:rStyle w:val="Hyperlink"/>
+          <w:rFonts w:cstheme="minorHAnsi"/>
+          <w:sz w:val="20"/>
+          <w:szCs w:val="20"/>
+          <w:lang w:val="it-IT"/>
+        </w:rPr>
+        <w:t>GitHub</w:t>
+      </w:r>
+      <w:r>
+        <w:fldChar w:fldCharType="end"/>
+      </w:r>
+      <w:r>
+        <w:rPr>
+          <w:rFonts w:cstheme="minorHAnsi"/>
+          <w:sz w:val="20"/>
+          <w:szCs w:val="20"/>
+          <w:lang w:val="it-IT"/>
+        </w:rPr>
+        <w:t xml:space="preserve"> | Bangalore, India.</w:t>
+      </w:r>
+      <w:r>
+        <w:rPr>
+          <w:rFonts w:cstheme="minorHAnsi"/>
+          <w:sz w:val="20"/>
+          <w:szCs w:val="20"/>
+          <w:lang w:val="it-IT"/>
+        </w:rPr>
+        <w:br/>
+      </w:r>
+      <w:r>
+        <w:rPr>
+          <w:rFonts w:cstheme="minorHAnsi"/>
+          <w:sz w:val="19"/>
+          <w:szCs w:val="19"/>
+          <w:lang w:val="it-IT"/>
+        </w:rPr>
+        <w:pict w14:anchorId="3F26B4EA">
+          <v:rect id="_x0000_i1025" style="width:0;height:1.5pt" o:hralign="center" o:hrstd="t" o:hr="t" fillcolor="#a0a0a0" stroked="f"/>
+        </w:pict>
+      </w:r>
+      <w:r>
+        <w:rPr>
+          <w:b/>
+          <w:bCs/>
+          <w:sz w:val="22"/>
+          <w:szCs w:val="22"/>
+        </w:rPr>
+        <w:t>PROFESSIONAL SUMMAR</w:t>
+      </w:r>
+      <w:r>
+        <w:rPr>
+          <w:b/>
+          <w:bCs/>
+          <w:sz w:val="22"/>
+          <w:szCs w:val="22"/>
+        </w:rPr>
+        <w:t>Y</w:t>
+      </w:r>
+    </w:p>
+    <w:p>
+      <w:pPr>
+        <w:spacing w:line="240" w:lineRule="auto"/>
+        <w:rPr>
+          <w:b/>
+          <w:bCs/>
+          <w:sz w:val="22"/>
+          <w:szCs w:val="22"/>
+        </w:rPr>
+      </w:pPr>
+      <w:r>
+        <w:rPr>
+          <w:sz w:val="21"/>
+          <w:szCs w:val="21"/>
+        </w:rPr>
+        <w:t>Java Backend Developer with experience building REST APIs and backend applications using Java, Spring Boot, SQL, and REST-based backend systems. Hands-on with PostgreSQL, Kafka, Redis, Docker, and backend application development through project work and continuous learning. Familiar with API debugging, exception handling, unit testing, and Agile-based development workflows. Currently deepening backend engineering fundamentals through Scaler Academy's Backend Specialization and seeking opportunities to grow as a backend engineer.</w:t>
+      </w:r>
+      <w:r>
+        <w:rPr>
+          <w:sz w:val="22"/>
+          <w:szCs w:val="22"/>
+        </w:rPr>
+        <w:br/>
+      </w:r>
+      <w:r>
+        <w:rPr>
+          <w:rFonts w:cstheme="minorHAnsi"/>
+          <w:sz w:val="19"/>
+          <w:szCs w:val="19"/>
+          <w:lang w:val="it-IT"/>
+        </w:rPr>
+        <w:pict w14:anchorId="4AF75285">
+          <v:rect id="_x0000_i1026" style="width:0;height:1.5pt" o:hralign="center" o:hrstd="t" o:hr="t" fillcolor="#a0a0a0" stroked="f"/>
+        </w:pict>
+      </w:r>
+      <w:r>
+        <w:rPr>
+          <w:b/>
+          <w:bCs/>
+          <w:sz w:val="22"/>
+          <w:szCs w:val="22"/>
+        </w:rPr>
+        <w:t>TECHNICAL SKILLS</w:t>
+      </w:r>
+    </w:p>
+    <w:p>
+      <w:pPr>
+        <w:spacing w:line="240" w:lineRule="auto"/>
+        <w:rPr>
+          <w:rFonts w:cstheme="minorHAnsi"/>
+          <w:sz w:val="21"/>
+          <w:szCs w:val="21"/>
         </w:rPr>
       </w:pPr>
       <w:r>
@@ -17,916 +241,545 @@
           <w:rFonts w:cstheme="minorHAnsi"/>
           <w:b/>
           <w:bCs/>
-          <w:sz w:val="36"/>
-          <w:szCs w:val="36"/>
-          <w:lang w:val="it-IT"/>
-        </w:rPr>
-        <w:t>Chandra Sekhar Vipparla</w:t>
+          <w:sz w:val="21"/>
+          <w:szCs w:val="21"/>
+        </w:rPr>
+        <w:t xml:space="preserve">Languages: </w:t>
+      </w:r>
+      <w:r>
+        <w:rPr>
+          <w:rFonts w:cstheme="minorHAnsi"/>
+          <w:sz w:val="21"/>
+          <w:szCs w:val="21"/>
+        </w:rPr>
+        <w:t>Java (Core Java, Java 8+), SQL</w:t>
+      </w:r>
+      <w:r>
+        <w:rPr>
+          <w:rFonts w:cstheme="minorHAnsi"/>
+          <w:sz w:val="21"/>
+          <w:szCs w:val="21"/>
+        </w:rPr>
+        <w:br/>
       </w:r>
       <w:r>
         <w:rPr>
           <w:rFonts w:cstheme="minorHAnsi"/>
           <w:b/>
           <w:bCs/>
-          <w:sz w:val="36"/>
-          <w:szCs w:val="36"/>
+          <w:sz w:val="21"/>
+          <w:szCs w:val="21"/>
+        </w:rPr>
+        <w:t xml:space="preserve">Frameworks: </w:t>
+      </w:r>
+      <w:r>
+        <w:rPr>
+          <w:rFonts w:cstheme="minorHAnsi"/>
+          <w:sz w:val="21"/>
+          <w:szCs w:val="21"/>
+        </w:rPr>
+        <w:t>Spring Boot, Spring MVC, Spring Data JPA, Spring Security, Spring Cloud</w:t>
+      </w:r>
+      <w:r>
+        <w:rPr>
+          <w:rFonts w:cstheme="minorHAnsi"/>
+          <w:b/>
+          <w:bCs/>
+          <w:sz w:val="21"/>
+          <w:szCs w:val="21"/>
+        </w:rPr>
+        <w:br/>
+      </w:r>
+      <w:r>
+        <w:rPr>
+          <w:rFonts w:cstheme="minorHAnsi"/>
+          <w:b/>
+          <w:bCs/>
+          <w:sz w:val="21"/>
+          <w:szCs w:val="21"/>
+        </w:rPr>
+        <w:t xml:space="preserve">Architecture: </w:t>
+      </w:r>
+      <w:r>
+        <w:rPr>
+          <w:rFonts w:cstheme="minorHAnsi"/>
+          <w:sz w:val="21"/>
+          <w:szCs w:val="21"/>
+        </w:rPr>
+        <w:t>REST APIs, Microservices, Event-Driven Systems</w:t>
+      </w:r>
+      <w:r>
+        <w:rPr>
+          <w:rFonts w:cstheme="minorHAnsi"/>
+          <w:sz w:val="21"/>
+          <w:szCs w:val="21"/>
+        </w:rPr>
+        <w:br/>
+      </w:r>
+      <w:r>
+        <w:rPr>
+          <w:rFonts w:cstheme="minorHAnsi"/>
+          <w:b/>
+          <w:bCs/>
+          <w:sz w:val="21"/>
+          <w:szCs w:val="21"/>
+        </w:rPr>
+        <w:t xml:space="preserve">Databases: </w:t>
+      </w:r>
+      <w:r>
+        <w:rPr>
+          <w:rFonts w:cstheme="minorHAnsi"/>
+          <w:sz w:val="21"/>
+          <w:szCs w:val="21"/>
+        </w:rPr>
+        <w:t>MySQL, PostgreSQL, SQL Querying, Query Optimization, Indexing</w:t>
+      </w:r>
+      <w:r>
+        <w:rPr>
+          <w:rFonts w:cstheme="minorHAnsi"/>
+          <w:b/>
+          <w:bCs/>
+          <w:sz w:val="21"/>
+          <w:szCs w:val="21"/>
+        </w:rPr>
+        <w:br/>
+      </w:r>
+      <w:r>
+        <w:rPr>
+          <w:rFonts w:cstheme="minorHAnsi"/>
+          <w:b/>
+          <w:bCs/>
+          <w:sz w:val="21"/>
+          <w:szCs w:val="21"/>
+        </w:rPr>
+        <w:t xml:space="preserve">Messaging &amp; Caching: </w:t>
+      </w:r>
+      <w:r>
+        <w:rPr>
+          <w:rFonts w:cstheme="minorHAnsi"/>
+          <w:sz w:val="21"/>
+          <w:szCs w:val="21"/>
+        </w:rPr>
+        <w:t>Apache Kafka, Redis</w:t>
+      </w:r>
+      <w:r>
+        <w:rPr>
+          <w:rFonts w:cstheme="minorHAnsi"/>
+          <w:b/>
+          <w:bCs/>
+          <w:sz w:val="21"/>
+          <w:szCs w:val="21"/>
+        </w:rPr>
+        <w:br/>
+      </w:r>
+      <w:r>
+        <w:rPr>
+          <w:rFonts w:cstheme="minorHAnsi"/>
+          <w:b/>
+          <w:bCs/>
+          <w:sz w:val="21"/>
+          <w:szCs w:val="21"/>
+        </w:rPr>
+        <w:t>Tools &amp; DevOps</w:t>
+      </w:r>
+      <w:r>
+        <w:rPr>
+          <w:rFonts w:cstheme="minorHAnsi"/>
+          <w:b/>
+          <w:bCs/>
+          <w:sz w:val="21"/>
+          <w:szCs w:val="21"/>
+        </w:rPr>
+        <w:t xml:space="preserve">: </w:t>
+      </w:r>
+      <w:r>
+        <w:rPr>
+          <w:rFonts w:cstheme="minorHAnsi"/>
+          <w:sz w:val="21"/>
+          <w:szCs w:val="21"/>
+        </w:rPr>
+        <w:t>Docker, Docker Compose, Maven, Git, Postman, IntelliJ IDEA</w:t>
+      </w:r>
+      <w:r>
+        <w:rPr>
+          <w:rFonts w:cstheme="minorHAnsi"/>
+          <w:sz w:val="21"/>
+          <w:szCs w:val="21"/>
+        </w:rPr>
+        <w:br/>
+      </w:r>
+      <w:r>
+        <w:rPr>
+          <w:rFonts w:cstheme="minorHAnsi"/>
+          <w:b/>
+          <w:bCs/>
+          <w:sz w:val="21"/>
+          <w:szCs w:val="21"/>
+        </w:rPr>
+        <w:t>Testing</w:t>
+      </w:r>
+      <w:r>
+        <w:rPr>
+          <w:rFonts w:cstheme="minorHAnsi"/>
+          <w:b/>
+          <w:bCs/>
+          <w:sz w:val="21"/>
+          <w:szCs w:val="21"/>
+        </w:rPr>
+        <w:t xml:space="preserve">: </w:t>
+      </w:r>
+      <w:r>
+        <w:rPr>
+          <w:rFonts w:cstheme="minorHAnsi"/>
+          <w:sz w:val="21"/>
+          <w:szCs w:val="21"/>
+        </w:rPr>
+        <w:t>JUnit, Mockito</w:t>
+      </w:r>
+      <w:r>
+        <w:rPr>
+          <w:rFonts w:cstheme="minorHAnsi"/>
+          <w:sz w:val="21"/>
+          <w:szCs w:val="21"/>
+        </w:rPr>
+        <w:br/>
+      </w:r>
+      <w:r>
+        <w:rPr>
+          <w:rFonts w:cstheme="minorHAnsi"/>
+          <w:b/>
+          <w:bCs/>
+          <w:sz w:val="21"/>
+          <w:szCs w:val="21"/>
+        </w:rPr>
+        <w:t xml:space="preserve">Cloud: </w:t>
+      </w:r>
+      <w:r>
+        <w:rPr>
+          <w:rFonts w:cstheme="minorHAnsi"/>
+          <w:sz w:val="21"/>
+          <w:szCs w:val="21"/>
+        </w:rPr>
+        <w:t>AWS (EC2, S3)</w:t>
+      </w:r>
+      <w:r>
+        <w:rPr>
+          <w:rFonts w:cstheme="minorHAnsi"/>
+          <w:b/>
+          <w:bCs/>
+          <w:sz w:val="21"/>
+          <w:szCs w:val="21"/>
+        </w:rPr>
+        <w:br/>
+      </w:r>
+      <w:r>
+        <w:rPr>
+          <w:rFonts w:cstheme="minorHAnsi"/>
+          <w:b/>
+          <w:bCs/>
+          <w:sz w:val="21"/>
+          <w:szCs w:val="21"/>
+        </w:rPr>
+        <w:t>Concepts</w:t>
+      </w:r>
+      <w:r>
+        <w:rPr>
+          <w:rFonts w:cstheme="minorHAnsi"/>
+          <w:b/>
+          <w:bCs/>
+          <w:sz w:val="21"/>
+          <w:szCs w:val="21"/>
+        </w:rPr>
+        <w:t xml:space="preserve">: </w:t>
+      </w:r>
+      <w:r>
+        <w:rPr>
+          <w:rFonts w:cstheme="minorHAnsi"/>
+          <w:sz w:val="21"/>
+          <w:szCs w:val="21"/>
+        </w:rPr>
+        <w:t>Exception Handling, API Debugging, Unit Testing, Agile Development</w:t>
+      </w:r>
+      <w:r>
+        <w:rPr>
+          <w:rFonts w:cstheme="minorHAnsi"/>
+          <w:b/>
+          <w:bCs/>
+          <w:sz w:val="21"/>
+          <w:szCs w:val="21"/>
+        </w:rPr>
+        <w:br/>
+      </w:r>
+      <w:r>
+        <w:rPr>
+          <w:rFonts w:cstheme="minorHAnsi"/>
+          <w:sz w:val="19"/>
+          <w:szCs w:val="19"/>
           <w:lang w:val="it-IT"/>
         </w:rPr>
-        <w:br/>
-      </w:r>
-      <w:bookmarkStart w:id="0" w:name="_Hlk224420702"/>
-      <w:r>
-        <w:rPr>
-          <w:rFonts w:cstheme="minorHAnsi"/>
+        <w:pict w14:anchorId="0D25862C">
+          <v:rect id="_x0000_i1027" style="width:0;height:1.5pt" o:hralign="center" o:hrstd="t" o:hr="t" fillcolor="#a0a0a0" stroked="f"/>
+        </w:pict>
+      </w:r>
+      <w:r>
+        <w:rPr>
+          <w:b/>
+          <w:bCs/>
           <w:sz w:val="22"/>
           <w:szCs w:val="22"/>
+        </w:rPr>
+        <w:t>EXPERIENCE</w:t>
+      </w:r>
+    </w:p>
+    <w:p>
+      <w:pPr>
+        <w:spacing w:line="240" w:lineRule="auto"/>
+        <w:rPr>
+          <w:b/>
+          <w:bCs/>
+          <w:sz w:val="22"/>
+          <w:szCs w:val="22"/>
+        </w:rPr>
+      </w:pPr>
+      <w:r>
+        <w:rPr>
+          <w:b/>
+          <w:bCs/>
+          <w:sz w:val="22"/>
+          <w:szCs w:val="22"/>
+        </w:rPr>
+        <w:t>Wipro Ltd. | Project Engineer (Developer L1) | May 2022 – Jan 2025</w:t>
+      </w:r>
+    </w:p>
+    <w:p>
+      <w:pPr>
+        <w:spacing w:line="240" w:lineRule="auto"/>
+        <w:rPr>
+          <w:b/>
+          <w:bCs/>
+          <w:sz w:val="22"/>
+          <w:szCs w:val="22"/>
+        </w:rPr>
+      </w:pPr>
+      <w:r>
+        <w:rPr>
+          <w:b/>
+          <w:bCs/>
+          <w:sz w:val="22"/>
+          <w:szCs w:val="22"/>
+        </w:rPr>
+        <w:t>Debt Visibility Dashboard | US Bank</w:t>
+      </w:r>
+    </w:p>
+    <w:p>
+      <w:pPr>
+        <w:numPr>
+          <w:ilvl w:val="0"/>
+          <w:numId w:val="12"/>
+        </w:numPr>
+        <w:spacing w:after="0" w:line="240" w:lineRule="auto"/>
+        <w:rPr>
+          <w:sz w:val="21"/>
+          <w:szCs w:val="21"/>
+        </w:rPr>
+      </w:pPr>
+      <w:r>
+        <w:rPr>
+          <w:sz w:val="21"/>
+          <w:szCs w:val="21"/>
+        </w:rPr>
+        <w:t>Developed REST APIs using Spring Boot and Spring Data JPA for aggregating financial data from multiple internal systems.</w:t>
+      </w:r>
+    </w:p>
+    <w:p>
+      <w:pPr>
+        <w:numPr>
+          <w:ilvl w:val="0"/>
+          <w:numId w:val="12"/>
+        </w:numPr>
+        <w:spacing w:after="0" w:line="240" w:lineRule="auto"/>
+        <w:rPr>
+          <w:sz w:val="21"/>
+          <w:szCs w:val="21"/>
+        </w:rPr>
+      </w:pPr>
+      <w:r>
+        <w:rPr>
+          <w:sz w:val="21"/>
+          <w:szCs w:val="21"/>
+        </w:rPr>
+        <w:t>Worked on centralized exception handling and standardized API responses to improve backend reliability and frontend integration</w:t>
+      </w:r>
+      <w:r>
+        <w:rPr>
+          <w:sz w:val="21"/>
+          <w:szCs w:val="21"/>
+        </w:rPr>
+        <w:t>.</w:t>
+      </w:r>
+    </w:p>
+    <w:p>
+      <w:pPr>
+        <w:numPr>
+          <w:ilvl w:val="0"/>
+          <w:numId w:val="12"/>
+        </w:numPr>
+        <w:spacing w:after="0" w:line="240" w:lineRule="auto"/>
+        <w:rPr>
+          <w:sz w:val="21"/>
+          <w:szCs w:val="21"/>
+        </w:rPr>
+      </w:pPr>
+      <w:r>
+        <w:rPr>
+          <w:sz w:val="21"/>
+          <w:szCs w:val="21"/>
+        </w:rPr>
+        <w:t>Created optimized DTO contracts for secure and efficient data transfer between backend and frontend systems</w:t>
+      </w:r>
+      <w:r>
+        <w:rPr>
+          <w:sz w:val="21"/>
+          <w:szCs w:val="21"/>
+        </w:rPr>
+        <w:t>.</w:t>
+      </w:r>
+    </w:p>
+    <w:p>
+      <w:pPr>
+        <w:numPr>
+          <w:ilvl w:val="0"/>
+          <w:numId w:val="12"/>
+        </w:numPr>
+        <w:spacing w:after="0" w:line="240" w:lineRule="auto"/>
+        <w:rPr>
+          <w:sz w:val="21"/>
+          <w:szCs w:val="21"/>
+        </w:rPr>
+      </w:pPr>
+      <w:r>
+        <w:rPr>
+          <w:sz w:val="21"/>
+          <w:szCs w:val="21"/>
+        </w:rPr>
+        <w:t>Assisted in debugging API and data-related issues during development and testing phases</w:t>
+      </w:r>
+      <w:r>
+        <w:rPr>
+          <w:sz w:val="21"/>
+          <w:szCs w:val="21"/>
+        </w:rPr>
+        <w:t>.</w:t>
+      </w:r>
+    </w:p>
+    <w:p>
+      <w:pPr>
+        <w:numPr>
+          <w:ilvl w:val="0"/>
+          <w:numId w:val="12"/>
+        </w:numPr>
+        <w:spacing w:after="0" w:line="240" w:lineRule="auto"/>
+        <w:rPr>
+          <w:b/>
+          <w:bCs/>
+          <w:sz w:val="21"/>
+          <w:szCs w:val="21"/>
+        </w:rPr>
+      </w:pPr>
+      <w:r>
+        <w:rPr>
+          <w:sz w:val="21"/>
+          <w:szCs w:val="21"/>
+        </w:rPr>
+        <w:t>Wrote unit tests using JUnit and Mockito to validate business logic and improve application stability</w:t>
+      </w:r>
+      <w:r>
+        <w:rPr>
+          <w:sz w:val="21"/>
+          <w:szCs w:val="21"/>
+        </w:rPr>
+        <w:t>.</w:t>
+      </w:r>
+    </w:p>
+    <w:p>
+      <w:pPr>
+        <w:numPr>
+          <w:ilvl w:val="0"/>
+          <w:numId w:val="12"/>
+        </w:numPr>
+        <w:spacing w:after="0" w:line="240" w:lineRule="auto"/>
+        <w:rPr>
+          <w:sz w:val="21"/>
+          <w:szCs w:val="21"/>
+        </w:rPr>
+      </w:pPr>
+      <w:r>
+        <w:rPr>
+          <w:sz w:val="21"/>
+          <w:szCs w:val="21"/>
+        </w:rPr>
+        <w:t>Collaborated within Agile teams during sprint planning, development, and review activities.</w:t>
+      </w:r>
+    </w:p>
+    <w:p>
+      <w:pPr>
+        <w:spacing w:line="240" w:lineRule="auto"/>
+        <w:rPr>
+          <w:b/>
+          <w:bCs/>
+        </w:rPr>
+      </w:pPr>
+      <w:r>
+        <w:rPr>
+          <w:rFonts w:cstheme="minorHAnsi"/>
+          <w:sz w:val="19"/>
+          <w:szCs w:val="19"/>
           <w:lang w:val="it-IT"/>
         </w:rPr>
-        <w:t xml:space="preserve">+91-9573145753 | </w:t>
+        <w:pict w14:anchorId="7398EEE4">
+          <v:rect id="_x0000_i1028" style="width:0;height:1.5pt" o:hralign="center" o:hrstd="t" o:hr="t" fillcolor="#a0a0a0" stroked="f"/>
+        </w:pict>
+      </w:r>
+      <w:r>
+        <w:rPr>
+          <w:b/>
+          <w:bCs/>
+          <w:sz w:val="22"/>
+          <w:szCs w:val="22"/>
+        </w:rPr>
+        <w:t>PERSONAL PROJECTS</w:t>
+      </w:r>
+    </w:p>
+    <w:p>
+      <w:pPr>
+        <w:spacing w:line="240" w:lineRule="auto"/>
+        <w:rPr>
+          <w:sz w:val="21"/>
+          <w:szCs w:val="21"/>
+        </w:rPr>
+      </w:pPr>
+      <w:r>
+        <w:rPr>
+          <w:b/>
+          <w:bCs/>
+          <w:sz w:val="21"/>
+          <w:szCs w:val="21"/>
+        </w:rPr>
+        <w:t xml:space="preserve">Office Resource Booking System (ORBS) </w:t>
+      </w:r>
+      <w:r>
+        <w:rPr>
+          <w:sz w:val="21"/>
+          <w:szCs w:val="21"/>
+        </w:rPr>
+        <w:t xml:space="preserve">| Java 17, Spring Boot 3, Spring Cloud, PostgreSQL, Kafka, Docker | </w:t>
       </w:r>
       <w:hyperlink r:id="rId5" w:history="1">
         <w:r>
           <w:rPr>
             <w:rStyle w:val="Hyperlink"/>
-            <w:rFonts w:cstheme="minorHAnsi"/>
-            <w:sz w:val="22"/>
-            <w:szCs w:val="22"/>
-            <w:lang w:val="it-IT"/>
-          </w:rPr>
-          <w:t>vipparlachandrasekhar@gmail.com</w:t>
-        </w:r>
-      </w:hyperlink>
-      <w:r>
-        <w:rPr>
-          <w:rFonts w:cstheme="minorHAnsi"/>
-          <w:sz w:val="22"/>
-          <w:szCs w:val="22"/>
-          <w:lang w:val="it-IT"/>
-        </w:rPr>
-        <w:t xml:space="preserve"> | </w:t>
-      </w:r>
-      <w:hyperlink r:id="rId6" w:history="1">
-        <w:r>
-          <w:rPr>
-            <w:rStyle w:val="Hyperlink"/>
-            <w:rFonts w:cstheme="minorHAnsi"/>
-            <w:sz w:val="22"/>
-            <w:szCs w:val="22"/>
-            <w:lang w:val="it-IT"/>
-          </w:rPr>
-          <w:t>LinkedIn</w:t>
-        </w:r>
-      </w:hyperlink>
-      <w:r>
-        <w:rPr>
-          <w:rFonts w:cstheme="minorHAnsi"/>
-          <w:sz w:val="22"/>
-          <w:szCs w:val="22"/>
-          <w:lang w:val="it-IT"/>
-        </w:rPr>
-        <w:t xml:space="preserve"> | </w:t>
-      </w:r>
-      <w:hyperlink r:id="rId7" w:history="1">
-        <w:r>
-          <w:rPr>
-            <w:rStyle w:val="Hyperlink"/>
-            <w:rFonts w:cstheme="minorHAnsi"/>
-            <w:sz w:val="22"/>
-            <w:szCs w:val="22"/>
-            <w:lang w:val="it-IT"/>
-          </w:rPr>
-          <w:t>GitHub</w:t>
-        </w:r>
-      </w:hyperlink>
-      <w:r>
-        <w:rPr>
-          <w:rFonts w:cstheme="minorHAnsi"/>
-          <w:sz w:val="22"/>
-          <w:szCs w:val="22"/>
-          <w:lang w:val="it-IT"/>
-        </w:rPr>
-        <w:t xml:space="preserve"> | Bangalore, India</w:t>
-      </w:r>
-      <w:bookmarkEnd w:id="0"/>
-      <w:r>
-        <w:rPr>
-          <w:rFonts w:cstheme="minorHAnsi"/>
-          <w:sz w:val="22"/>
-          <w:szCs w:val="22"/>
-          <w:lang w:val="it-IT"/>
-        </w:rPr>
-        <w:br/>
-      </w:r>
-      <w:r>
-        <w:rPr>
-          <w:rFonts w:cstheme="minorHAnsi"/>
-          <w:sz w:val="21"/>
-          <w:szCs w:val="21"/>
-          <w:lang w:val="it-IT"/>
-        </w:rPr>
-        <w:pict w14:anchorId="233F11A9">
-          <v:rect id="_x0000_i1034" style="width:0;height:1.5pt" o:hralign="center" o:hrstd="t" o:hr="t" fillcolor="#a0a0a0" stroked="f"/>
-        </w:pict>
-      </w:r>
-    </w:p>
-    <w:p>
-      <w:pPr>
-        <w:spacing w:line="240" w:lineRule="auto"/>
-        <w:rPr>
-          <w:rFonts w:cstheme="minorHAnsi"/>
-          <w:b/>
-          <w:bCs/>
-        </w:rPr>
-      </w:pPr>
-      <w:r>
-        <w:rPr>
-          <w:rFonts w:cstheme="minorHAnsi"/>
-          <w:b/>
-          <w:bCs/>
-        </w:rPr>
-        <w:t>Professional Summary:</w:t>
-      </w:r>
-    </w:p>
-    <w:p>
-      <w:pPr>
-        <w:spacing w:line="240" w:lineRule="auto"/>
-        <w:rPr>
-          <w:rFonts w:cstheme="minorHAnsi"/>
-          <w:sz w:val="21"/>
-          <w:szCs w:val="21"/>
-        </w:rPr>
-      </w:pPr>
-      <w:r>
-        <w:rPr>
-          <w:rFonts w:cstheme="minorHAnsi"/>
-          <w:sz w:val="22"/>
-          <w:szCs w:val="22"/>
-        </w:rPr>
-        <w:t>Java Backend Developer with nearly 3 years of professional experience in building and maintaining scalable enterprise applications. Proficient in developing robust RESTful APIs and Microservices using Java and the Spring Boot ecosystem. Dedicated to high code quality by following industry standard best practices</w:t>
-      </w:r>
-      <w:r>
-        <w:rPr>
-          <w:rFonts w:cstheme="minorHAnsi"/>
-          <w:sz w:val="21"/>
-          <w:szCs w:val="21"/>
-        </w:rPr>
-        <w:br/>
-      </w:r>
-      <w:r>
-        <w:rPr>
-          <w:rFonts w:cstheme="minorHAnsi"/>
-          <w:sz w:val="21"/>
-          <w:szCs w:val="21"/>
-          <w:lang w:val="it-IT"/>
-        </w:rPr>
-        <w:pict w14:anchorId="475AF557">
-          <v:rect id="_x0000_i1035" style="width:0;height:1.5pt" o:hralign="center" o:hrstd="t" o:hr="t" fillcolor="#a0a0a0" stroked="f"/>
-        </w:pict>
-      </w:r>
-    </w:p>
-    <w:p>
-      <w:pPr>
-        <w:spacing w:line="240" w:lineRule="auto"/>
-        <w:rPr>
-          <w:rFonts w:cstheme="minorHAnsi"/>
-          <w:b/>
-          <w:bCs/>
-        </w:rPr>
-      </w:pPr>
-      <w:r>
-        <w:rPr>
-          <w:rFonts w:cstheme="minorHAnsi"/>
-          <w:b/>
-          <w:bCs/>
-        </w:rPr>
-        <w:t>Technical Skills:</w:t>
-      </w:r>
-    </w:p>
-    <w:p>
-      <w:pPr>
-        <w:spacing w:line="240" w:lineRule="auto"/>
-        <w:rPr>
-          <w:rFonts w:cstheme="minorHAnsi"/>
-          <w:sz w:val="22"/>
-          <w:szCs w:val="22"/>
-        </w:rPr>
-      </w:pPr>
-      <w:r>
-        <w:rPr>
-          <w:rFonts w:cstheme="minorHAnsi"/>
-          <w:b/>
-          <w:bCs/>
-          <w:sz w:val="22"/>
-          <w:szCs w:val="22"/>
-        </w:rPr>
-        <w:t xml:space="preserve">Languages: </w:t>
-      </w:r>
-      <w:r>
-        <w:rPr>
-          <w:rFonts w:cstheme="minorHAnsi"/>
-          <w:sz w:val="22"/>
-          <w:szCs w:val="22"/>
-        </w:rPr>
-        <w:t>Java (Core Java, Java 8+), SQL</w:t>
-      </w:r>
-      <w:r>
-        <w:rPr>
-          <w:rFonts w:cstheme="minorHAnsi"/>
-          <w:sz w:val="22"/>
-          <w:szCs w:val="22"/>
-        </w:rPr>
-        <w:br/>
-      </w:r>
-      <w:r>
-        <w:rPr>
-          <w:rFonts w:cstheme="minorHAnsi"/>
-          <w:b/>
-          <w:bCs/>
-          <w:sz w:val="22"/>
-          <w:szCs w:val="22"/>
-        </w:rPr>
-        <w:t xml:space="preserve">Frameworks: </w:t>
-      </w:r>
-      <w:r>
-        <w:rPr>
-          <w:rFonts w:cstheme="minorHAnsi"/>
-          <w:sz w:val="22"/>
-          <w:szCs w:val="22"/>
-        </w:rPr>
-        <w:t>Spring Boot, Spring MVC, Spring Data JPA, Spring Security</w:t>
-      </w:r>
-      <w:r>
-        <w:rPr>
-          <w:rFonts w:cstheme="minorHAnsi"/>
-          <w:sz w:val="22"/>
-          <w:szCs w:val="22"/>
-        </w:rPr>
-        <w:t>, Spring Cloud</w:t>
-      </w:r>
-      <w:r>
-        <w:rPr>
-          <w:rFonts w:cstheme="minorHAnsi"/>
-          <w:b/>
-          <w:bCs/>
-          <w:sz w:val="22"/>
-          <w:szCs w:val="22"/>
-        </w:rPr>
-        <w:br/>
-        <w:t xml:space="preserve">Architecture: </w:t>
-      </w:r>
-      <w:r>
-        <w:rPr>
-          <w:rFonts w:cstheme="minorHAnsi"/>
-          <w:sz w:val="22"/>
-          <w:szCs w:val="22"/>
-        </w:rPr>
-        <w:t>REST APIs, Microservices, Event-Driven Systems</w:t>
-      </w:r>
-      <w:r>
-        <w:rPr>
-          <w:rFonts w:cstheme="minorHAnsi"/>
-          <w:sz w:val="22"/>
-          <w:szCs w:val="22"/>
-        </w:rPr>
-        <w:br/>
-      </w:r>
-      <w:r>
-        <w:rPr>
-          <w:rFonts w:cstheme="minorHAnsi"/>
-          <w:b/>
-          <w:bCs/>
-          <w:sz w:val="22"/>
-          <w:szCs w:val="22"/>
-        </w:rPr>
-        <w:t xml:space="preserve">Databases: </w:t>
-      </w:r>
-      <w:r>
-        <w:rPr>
-          <w:rFonts w:cstheme="minorHAnsi"/>
-          <w:sz w:val="22"/>
-          <w:szCs w:val="22"/>
-        </w:rPr>
-        <w:t>MySQL, PostgreSQL, Query Optimization, Indexing</w:t>
-      </w:r>
-      <w:r>
-        <w:rPr>
-          <w:rFonts w:cstheme="minorHAnsi"/>
-          <w:b/>
-          <w:bCs/>
-          <w:sz w:val="22"/>
-          <w:szCs w:val="22"/>
-        </w:rPr>
-        <w:br/>
-        <w:t>Messaging &amp; Caching</w:t>
-      </w:r>
-      <w:r>
-        <w:rPr>
-          <w:rFonts w:cstheme="minorHAnsi"/>
-          <w:sz w:val="22"/>
-          <w:szCs w:val="22"/>
-        </w:rPr>
-        <w:t>: Apache Kafka, Redis</w:t>
-      </w:r>
-      <w:r>
-        <w:rPr>
-          <w:rFonts w:cstheme="minorHAnsi"/>
-          <w:b/>
-          <w:bCs/>
-          <w:sz w:val="22"/>
-          <w:szCs w:val="22"/>
-        </w:rPr>
-        <w:br/>
-        <w:t xml:space="preserve">DevOps: </w:t>
-      </w:r>
-      <w:r>
-        <w:rPr>
-          <w:rFonts w:cstheme="minorHAnsi"/>
-          <w:sz w:val="22"/>
-          <w:szCs w:val="22"/>
-        </w:rPr>
-        <w:t>Docker, Docker Compose, AWS (EC2, S3)</w:t>
-      </w:r>
-      <w:r>
-        <w:rPr>
-          <w:rFonts w:cstheme="minorHAnsi"/>
-          <w:b/>
-          <w:bCs/>
-          <w:sz w:val="22"/>
-          <w:szCs w:val="22"/>
-        </w:rPr>
-        <w:br/>
-        <w:t xml:space="preserve">Testing &amp; Tools: </w:t>
-      </w:r>
-      <w:r>
-        <w:rPr>
-          <w:rFonts w:cstheme="minorHAnsi"/>
-          <w:sz w:val="22"/>
-          <w:szCs w:val="22"/>
-        </w:rPr>
-        <w:t>JUnit, Mockito, Maven, Git, IntelliJ IDEA, Postma</w:t>
-      </w:r>
-      <w:r>
-        <w:rPr>
-          <w:rFonts w:cstheme="minorHAnsi"/>
-          <w:sz w:val="22"/>
-          <w:szCs w:val="22"/>
-        </w:rPr>
-        <w:t>n</w:t>
-      </w:r>
-      <w:r>
-        <w:rPr>
-          <w:rFonts w:cstheme="minorHAnsi"/>
-          <w:sz w:val="21"/>
-          <w:szCs w:val="21"/>
-        </w:rPr>
-        <w:br/>
-      </w:r>
-      <w:r>
-        <w:rPr>
-          <w:rFonts w:cstheme="minorHAnsi"/>
-          <w:sz w:val="21"/>
-          <w:szCs w:val="21"/>
-          <w:lang w:val="it-IT"/>
-        </w:rPr>
-        <w:pict w14:anchorId="03B233E3">
-          <v:rect id="_x0000_i1036" style="width:0;height:1.5pt" o:hralign="center" o:hrstd="t" o:hr="t" fillcolor="#a0a0a0" stroked="f"/>
-        </w:pict>
-      </w:r>
-    </w:p>
-    <w:p>
-      <w:pPr>
-        <w:spacing w:line="240" w:lineRule="auto"/>
-        <w:rPr>
-          <w:rFonts w:cstheme="minorHAnsi"/>
-          <w:b/>
-          <w:bCs/>
-          <w:sz w:val="28"/>
-          <w:szCs w:val="28"/>
-        </w:rPr>
-      </w:pPr>
-      <w:bookmarkStart w:id="1" w:name="_Hlk224420815"/>
-      <w:r>
-        <w:rPr>
-          <w:rFonts w:cstheme="minorHAnsi"/>
-          <w:b/>
-          <w:bCs/>
-        </w:rPr>
-        <w:t>Experience:</w:t>
-      </w:r>
-    </w:p>
-    <w:p>
-      <w:pPr>
-        <w:spacing w:line="240" w:lineRule="auto"/>
-        <w:rPr>
-          <w:rFonts w:cstheme="minorHAnsi"/>
-          <w:b/>
-          <w:bCs/>
-          <w:sz w:val="22"/>
-          <w:szCs w:val="22"/>
-        </w:rPr>
-      </w:pPr>
-      <w:r>
-        <w:rPr>
-          <w:rFonts w:cstheme="minorHAnsi"/>
-          <w:b/>
-          <w:bCs/>
-          <w:sz w:val="22"/>
-          <w:szCs w:val="22"/>
-        </w:rPr>
-        <w:t>Wipro Ltd. | Project Engineer (Developer L1) | May 2022 – Jan 2025</w:t>
-      </w:r>
-    </w:p>
-    <w:p>
-      <w:pPr>
-        <w:pStyle w:val="ListParagraph"/>
-        <w:numPr>
-          <w:ilvl w:val="0"/>
-          <w:numId w:val="1"/>
-        </w:numPr>
-        <w:spacing w:line="240" w:lineRule="auto"/>
-        <w:jc w:val="both"/>
-        <w:rPr>
-          <w:rFonts w:cstheme="minorHAnsi"/>
-          <w:b/>
-          <w:bCs/>
-          <w:sz w:val="22"/>
-          <w:szCs w:val="22"/>
-        </w:rPr>
-      </w:pPr>
-      <w:r>
-        <w:rPr>
-          <w:rFonts w:cstheme="minorHAnsi"/>
-          <w:b/>
-          <w:bCs/>
-          <w:sz w:val="22"/>
-          <w:szCs w:val="22"/>
-        </w:rPr>
-        <w:t xml:space="preserve">Debt Visibility Dashboard: </w:t>
-      </w:r>
-      <w:r>
-        <w:rPr>
-          <w:rFonts w:cstheme="minorHAnsi"/>
-          <w:sz w:val="22"/>
-          <w:szCs w:val="22"/>
-        </w:rPr>
-        <w:t>Developed a centralized retail banking dashboard aggregating loan data from legacy systems, improving financial transparency for end-users.</w:t>
-      </w:r>
-    </w:p>
-    <w:p>
-      <w:pPr>
-        <w:pStyle w:val="ListParagraph"/>
-        <w:numPr>
-          <w:ilvl w:val="0"/>
-          <w:numId w:val="1"/>
-        </w:numPr>
-        <w:spacing w:line="240" w:lineRule="auto"/>
-        <w:jc w:val="both"/>
-        <w:rPr>
-          <w:rFonts w:cstheme="minorHAnsi"/>
-          <w:sz w:val="22"/>
-          <w:szCs w:val="22"/>
-        </w:rPr>
-      </w:pPr>
-      <w:r>
-        <w:rPr>
-          <w:rFonts w:cstheme="minorHAnsi"/>
-          <w:b/>
-          <w:bCs/>
-          <w:sz w:val="22"/>
-          <w:szCs w:val="22"/>
-        </w:rPr>
-        <w:t xml:space="preserve">Performance Optimization: </w:t>
-      </w:r>
-      <w:r>
-        <w:rPr>
-          <w:rFonts w:cstheme="minorHAnsi"/>
-          <w:sz w:val="22"/>
-          <w:szCs w:val="22"/>
-        </w:rPr>
-        <w:t>Engineered a centralized exception handling framework, standardizing API responses and achieving a 20% improvement in frontend integration speed.</w:t>
-      </w:r>
-    </w:p>
-    <w:p>
-      <w:pPr>
-        <w:pStyle w:val="ListParagraph"/>
-        <w:numPr>
-          <w:ilvl w:val="0"/>
-          <w:numId w:val="1"/>
-        </w:numPr>
-        <w:spacing w:line="240" w:lineRule="auto"/>
-        <w:jc w:val="both"/>
-        <w:rPr>
-          <w:rFonts w:cstheme="minorHAnsi"/>
-          <w:sz w:val="22"/>
-          <w:szCs w:val="22"/>
-        </w:rPr>
-      </w:pPr>
-      <w:r>
-        <w:rPr>
-          <w:rFonts w:cstheme="minorHAnsi"/>
-          <w:b/>
-          <w:bCs/>
-          <w:sz w:val="22"/>
-          <w:szCs w:val="22"/>
-        </w:rPr>
-        <w:t xml:space="preserve">Data Strategy: </w:t>
-      </w:r>
-      <w:r>
-        <w:rPr>
-          <w:rFonts w:cstheme="minorHAnsi"/>
-          <w:sz w:val="22"/>
-          <w:szCs w:val="22"/>
-        </w:rPr>
-        <w:t xml:space="preserve">Designed optimized DTO contracts to streamline data retrieval, reducing payload sizes and enhancing </w:t>
-      </w:r>
-      <w:r>
-        <w:rPr>
-          <w:rFonts w:cstheme="minorHAnsi"/>
-          <w:sz w:val="22"/>
-          <w:szCs w:val="22"/>
-        </w:rPr>
-        <w:t>application</w:t>
-      </w:r>
-      <w:r>
-        <w:rPr>
-          <w:rFonts w:cstheme="minorHAnsi"/>
-          <w:sz w:val="22"/>
-          <w:szCs w:val="22"/>
-        </w:rPr>
-        <w:t xml:space="preserve"> responsiveness</w:t>
-      </w:r>
-      <w:r>
-        <w:rPr>
-          <w:rFonts w:cstheme="minorHAnsi"/>
-          <w:sz w:val="22"/>
-          <w:szCs w:val="22"/>
-        </w:rPr>
-        <w:t>.</w:t>
-      </w:r>
-    </w:p>
-    <w:p>
-      <w:pPr>
-        <w:pStyle w:val="ListParagraph"/>
-        <w:numPr>
-          <w:ilvl w:val="0"/>
-          <w:numId w:val="1"/>
-        </w:numPr>
-        <w:spacing w:line="240" w:lineRule="auto"/>
-        <w:jc w:val="both"/>
-        <w:rPr>
-          <w:rFonts w:cstheme="minorHAnsi"/>
-          <w:sz w:val="22"/>
-          <w:szCs w:val="22"/>
-        </w:rPr>
-      </w:pPr>
-      <w:r>
-        <w:rPr>
-          <w:rFonts w:cstheme="minorHAnsi"/>
-          <w:b/>
-          <w:bCs/>
-          <w:sz w:val="22"/>
-          <w:szCs w:val="22"/>
-        </w:rPr>
-        <w:t>Quality Assurance</w:t>
-      </w:r>
-      <w:r>
-        <w:rPr>
-          <w:rFonts w:cstheme="minorHAnsi"/>
-          <w:b/>
-          <w:bCs/>
-          <w:sz w:val="22"/>
-          <w:szCs w:val="22"/>
-        </w:rPr>
-        <w:t xml:space="preserve">: </w:t>
-      </w:r>
-      <w:r>
-        <w:rPr>
-          <w:rFonts w:cstheme="minorHAnsi"/>
-          <w:sz w:val="22"/>
-          <w:szCs w:val="22"/>
-        </w:rPr>
-        <w:t xml:space="preserve">Maintained </w:t>
-      </w:r>
-      <w:r>
-        <w:rPr>
-          <w:rFonts w:cstheme="minorHAnsi"/>
-          <w:sz w:val="22"/>
-          <w:szCs w:val="22"/>
-        </w:rPr>
-        <w:t>80%+ unit test coverage using JUnit and Mockito, ensuring system reliability during high-traffic billing cycles.</w:t>
-      </w:r>
-    </w:p>
-    <w:p>
-      <w:pPr>
-        <w:pStyle w:val="ListParagraph"/>
-        <w:numPr>
-          <w:ilvl w:val="0"/>
-          <w:numId w:val="1"/>
-        </w:numPr>
-        <w:spacing w:line="240" w:lineRule="auto"/>
-        <w:jc w:val="both"/>
-        <w:rPr>
-          <w:rFonts w:cstheme="minorHAnsi"/>
-          <w:sz w:val="22"/>
-          <w:szCs w:val="22"/>
-        </w:rPr>
-      </w:pPr>
-      <w:r>
-        <w:rPr>
-          <w:rFonts w:cstheme="minorHAnsi"/>
-          <w:b/>
-          <w:bCs/>
-          <w:sz w:val="22"/>
-          <w:szCs w:val="22"/>
-        </w:rPr>
-        <w:t xml:space="preserve">Agile Delivery: </w:t>
-      </w:r>
-      <w:r>
-        <w:rPr>
-          <w:rFonts w:cstheme="minorHAnsi"/>
-          <w:sz w:val="22"/>
-          <w:szCs w:val="22"/>
-        </w:rPr>
-        <w:t>Collaborated in a high-velocity environment, delivering production-ready features in 2-week sprints using Jira for documentation</w:t>
-      </w:r>
-      <w:r>
-        <w:rPr>
-          <w:rFonts w:cstheme="minorHAnsi"/>
-          <w:sz w:val="22"/>
-          <w:szCs w:val="22"/>
-        </w:rPr>
-        <w:t>.</w:t>
-      </w:r>
-    </w:p>
-    <w:p>
-      <w:pPr>
-        <w:spacing w:line="240" w:lineRule="auto"/>
-        <w:jc w:val="both"/>
-        <w:rPr>
-          <w:rFonts w:cstheme="minorHAnsi"/>
-          <w:sz w:val="22"/>
-          <w:szCs w:val="22"/>
-        </w:rPr>
-      </w:pPr>
-      <w:r>
-        <w:rPr>
-          <w:rFonts w:cstheme="minorHAnsi"/>
-          <w:sz w:val="21"/>
-          <w:szCs w:val="21"/>
-          <w:lang w:val="it-IT"/>
-        </w:rPr>
-        <w:pict w14:anchorId="19E91061">
-          <v:rect id="_x0000_i1042" style="width:0;height:1.5pt" o:hralign="center" o:hrstd="t" o:hr="t" fillcolor="#a0a0a0" stroked="f"/>
-        </w:pict>
-      </w:r>
-    </w:p>
-    <w:bookmarkEnd w:id="1"/>
-    <w:p>
-      <w:pPr>
-        <w:spacing w:line="240" w:lineRule="auto"/>
-        <w:rPr>
-          <w:rFonts w:cstheme="minorHAnsi"/>
-          <w:b/>
-          <w:bCs/>
-        </w:rPr>
-      </w:pPr>
-      <w:r>
-        <w:rPr>
-          <w:rFonts w:cstheme="minorHAnsi"/>
-          <w:b/>
-          <w:bCs/>
-        </w:rPr>
-        <w:t xml:space="preserve">Personal </w:t>
-      </w:r>
-      <w:r>
-        <w:rPr>
-          <w:rFonts w:cstheme="minorHAnsi"/>
-          <w:b/>
-          <w:bCs/>
-        </w:rPr>
-        <w:t>Projects:</w:t>
-      </w:r>
-    </w:p>
-    <w:p>
-      <w:pPr>
-        <w:spacing w:line="240" w:lineRule="auto"/>
-        <w:rPr>
-          <w:rFonts w:cstheme="minorHAnsi"/>
-          <w:sz w:val="22"/>
-          <w:szCs w:val="22"/>
-        </w:rPr>
-      </w:pPr>
-      <w:r>
-        <w:rPr>
-          <w:rFonts w:cstheme="minorHAnsi"/>
-          <w:b/>
-          <w:bCs/>
-        </w:rPr>
-        <w:t xml:space="preserve">Office Resource Booking System (ORBS) </w:t>
-      </w:r>
-      <w:r>
-        <w:rPr>
-          <w:rFonts w:cstheme="minorHAnsi"/>
-          <w:sz w:val="22"/>
-          <w:szCs w:val="22"/>
-        </w:rPr>
-        <w:t xml:space="preserve">| Java 17, Spring Boot 3, Spring Cloud, PostgreSQL, Kafka, Docker | </w:t>
-      </w:r>
-      <w:hyperlink r:id="rId8" w:history="1">
-        <w:r>
-          <w:rPr>
-            <w:rStyle w:val="Hyperlink"/>
-            <w:rFonts w:cstheme="minorHAnsi"/>
-            <w:sz w:val="22"/>
-            <w:szCs w:val="22"/>
-          </w:rPr>
-          <w:t>GitH</w:t>
-        </w:r>
-        <w:r>
-          <w:rPr>
-            <w:rStyle w:val="Hyperlink"/>
-            <w:rFonts w:cstheme="minorHAnsi"/>
-            <w:sz w:val="22"/>
-            <w:szCs w:val="22"/>
-          </w:rPr>
-          <w:t>u</w:t>
-        </w:r>
-        <w:r>
-          <w:rPr>
-            <w:rStyle w:val="Hyperlink"/>
-            <w:rFonts w:cstheme="minorHAnsi"/>
-            <w:sz w:val="22"/>
-            <w:szCs w:val="22"/>
-          </w:rPr>
-          <w:t>b</w:t>
-        </w:r>
-      </w:hyperlink>
-    </w:p>
-    <w:p>
-      <w:pPr>
-        <w:pStyle w:val="ListParagraph"/>
-        <w:numPr>
-          <w:ilvl w:val="0"/>
-          <w:numId w:val="4"/>
-        </w:numPr>
-        <w:spacing w:line="240" w:lineRule="auto"/>
-        <w:rPr>
-          <w:rFonts w:cstheme="minorHAnsi"/>
-          <w:sz w:val="22"/>
-          <w:szCs w:val="22"/>
-        </w:rPr>
-      </w:pPr>
-      <w:r>
-        <w:rPr>
-          <w:rFonts w:cstheme="minorHAnsi"/>
-          <w:sz w:val="22"/>
-          <w:szCs w:val="22"/>
-        </w:rPr>
-        <w:t>Built a microservices-based office booking platform using API Gateway, Eureka, Config Server, and database-per-service architecture.</w:t>
-      </w:r>
-    </w:p>
-    <w:p>
-      <w:pPr>
-        <w:pStyle w:val="ListParagraph"/>
-        <w:numPr>
-          <w:ilvl w:val="0"/>
-          <w:numId w:val="4"/>
-        </w:numPr>
-        <w:spacing w:line="240" w:lineRule="auto"/>
-        <w:rPr>
-          <w:rFonts w:cstheme="minorHAnsi"/>
-          <w:sz w:val="22"/>
-          <w:szCs w:val="22"/>
-        </w:rPr>
-      </w:pPr>
-      <w:r>
-        <w:rPr>
-          <w:rFonts w:cstheme="minorHAnsi"/>
-          <w:sz w:val="22"/>
-          <w:szCs w:val="22"/>
-        </w:rPr>
-        <w:t>Implemented JWT authentication and role-based authorization for secure access across multiple Spring Boot services.</w:t>
-      </w:r>
-    </w:p>
-    <w:p>
-      <w:pPr>
-        <w:pStyle w:val="ListParagraph"/>
-        <w:numPr>
-          <w:ilvl w:val="0"/>
-          <w:numId w:val="4"/>
-        </w:numPr>
-        <w:spacing w:line="240" w:lineRule="auto"/>
-        <w:rPr>
-          <w:rFonts w:cstheme="minorHAnsi"/>
-          <w:sz w:val="22"/>
-          <w:szCs w:val="22"/>
-        </w:rPr>
-      </w:pPr>
-      <w:r>
-        <w:rPr>
-          <w:rFonts w:cstheme="minorHAnsi"/>
-          <w:sz w:val="22"/>
-          <w:szCs w:val="22"/>
-        </w:rPr>
-        <w:t>Developed booking workflows with overlap detection, resource validation, and ownership-based cancellation to enforce real business rules.</w:t>
-      </w:r>
-    </w:p>
-    <w:p>
-      <w:pPr>
-        <w:pStyle w:val="ListParagraph"/>
-        <w:numPr>
-          <w:ilvl w:val="0"/>
-          <w:numId w:val="4"/>
-        </w:numPr>
-        <w:spacing w:line="240" w:lineRule="auto"/>
-        <w:rPr>
-          <w:rFonts w:cstheme="minorHAnsi"/>
-          <w:sz w:val="22"/>
-          <w:szCs w:val="22"/>
-        </w:rPr>
-      </w:pPr>
-      <w:r>
-        <w:rPr>
-          <w:rFonts w:cstheme="minorHAnsi"/>
-          <w:sz w:val="22"/>
-          <w:szCs w:val="22"/>
-        </w:rPr>
-        <w:t>Integrated OpenFeign and Kafka for synchronous service communication and asynchronous notification processing.</w:t>
-      </w:r>
-    </w:p>
-    <w:p>
-      <w:pPr>
-        <w:pStyle w:val="ListParagraph"/>
-        <w:numPr>
-          <w:ilvl w:val="0"/>
-          <w:numId w:val="4"/>
-        </w:numPr>
-        <w:spacing w:line="240" w:lineRule="auto"/>
-        <w:rPr>
-          <w:rFonts w:cstheme="minorHAnsi"/>
-          <w:sz w:val="22"/>
-          <w:szCs w:val="22"/>
-        </w:rPr>
-      </w:pPr>
-      <w:r>
-        <w:rPr>
-          <w:rFonts w:cstheme="minorHAnsi"/>
-          <w:sz w:val="22"/>
-          <w:szCs w:val="22"/>
-        </w:rPr>
-        <w:t>Containerized the system with Docker Compose and enabled Swagger/OpenAPI and Actuator for demo-ready deployment and observability.</w:t>
-      </w:r>
-    </w:p>
-    <w:p>
-      <w:pPr>
-        <w:spacing w:line="240" w:lineRule="auto"/>
-        <w:rPr>
-          <w:rFonts w:cstheme="minorHAnsi"/>
-          <w:sz w:val="22"/>
-          <w:szCs w:val="22"/>
-        </w:rPr>
-      </w:pPr>
-      <w:r>
-        <w:rPr>
-          <w:rFonts w:cstheme="minorHAnsi"/>
-          <w:b/>
-          <w:bCs/>
-        </w:rPr>
-        <w:t>EMI Planner (Loan Atlas)</w:t>
-      </w:r>
-      <w:r>
-        <w:rPr>
-          <w:rFonts w:cstheme="minorHAnsi"/>
-          <w:b/>
-          <w:bCs/>
-          <w:sz w:val="21"/>
-          <w:szCs w:val="21"/>
-        </w:rPr>
-        <w:t xml:space="preserve"> </w:t>
-      </w:r>
-      <w:r>
-        <w:rPr>
-          <w:rFonts w:cstheme="minorHAnsi"/>
-          <w:sz w:val="22"/>
-          <w:szCs w:val="22"/>
-        </w:rPr>
-        <w:t>| Java 17, Spring Boot 3, Spring Security, MySQL, Redis, Docker</w:t>
-      </w:r>
-      <w:r>
-        <w:rPr>
-          <w:rFonts w:cstheme="minorHAnsi"/>
-          <w:sz w:val="22"/>
-          <w:szCs w:val="22"/>
-        </w:rPr>
-        <w:t xml:space="preserve"> | </w:t>
-      </w:r>
-      <w:hyperlink r:id="rId9" w:history="1">
-        <w:r>
-          <w:rPr>
-            <w:rStyle w:val="Hyperlink"/>
-            <w:rFonts w:cstheme="minorHAnsi"/>
-            <w:sz w:val="22"/>
-            <w:szCs w:val="22"/>
+            <w:sz w:val="21"/>
+            <w:szCs w:val="21"/>
           </w:rPr>
           <w:t>GitHub</w:t>
         </w:r>
@@ -934,105 +787,185 @@
     </w:p>
     <w:p>
       <w:pPr>
-        <w:pStyle w:val="ListParagraph"/>
         <w:numPr>
           <w:ilvl w:val="0"/>
-          <w:numId w:val="5"/>
+          <w:numId w:val="13"/>
         </w:numPr>
-        <w:spacing w:line="240" w:lineRule="auto"/>
-        <w:rPr>
-          <w:rFonts w:cstheme="minorHAnsi"/>
-          <w:sz w:val="22"/>
-          <w:szCs w:val="22"/>
-        </w:rPr>
-      </w:pPr>
-      <w:r>
-        <w:rPr>
-          <w:rFonts w:cstheme="minorHAnsi"/>
-          <w:sz w:val="22"/>
-          <w:szCs w:val="22"/>
-        </w:rPr>
-        <w:t>Built a full-stack EMI planning platform to manage loans and forecast monthly repayment obligations through a 12-month calendar view.</w:t>
+        <w:spacing w:after="0" w:line="240" w:lineRule="auto"/>
+        <w:rPr>
+          <w:sz w:val="21"/>
+          <w:szCs w:val="21"/>
+        </w:rPr>
+      </w:pPr>
+      <w:r>
+        <w:rPr>
+          <w:sz w:val="21"/>
+          <w:szCs w:val="21"/>
+        </w:rPr>
+        <w:t>Developed Spring Boot microservices for office resource booking with JWT-based authentication and role-based authorization</w:t>
+      </w:r>
+      <w:r>
+        <w:rPr>
+          <w:sz w:val="21"/>
+          <w:szCs w:val="21"/>
+        </w:rPr>
+        <w:t>.</w:t>
       </w:r>
     </w:p>
     <w:p>
       <w:pPr>
-        <w:pStyle w:val="ListParagraph"/>
         <w:numPr>
           <w:ilvl w:val="0"/>
-          <w:numId w:val="5"/>
+          <w:numId w:val="13"/>
         </w:numPr>
-        <w:spacing w:line="240" w:lineRule="auto"/>
-        <w:rPr>
-          <w:rFonts w:cstheme="minorHAnsi"/>
-          <w:sz w:val="22"/>
-          <w:szCs w:val="22"/>
-        </w:rPr>
-      </w:pPr>
-      <w:r>
-        <w:rPr>
-          <w:rFonts w:cstheme="minorHAnsi"/>
-          <w:sz w:val="22"/>
-          <w:szCs w:val="22"/>
-        </w:rPr>
-        <w:t>Implemented JWT-based authentication, user-scoped access control, and robust validation for secure, reliable loan management.</w:t>
+        <w:spacing w:after="0" w:line="240" w:lineRule="auto"/>
+        <w:rPr>
+          <w:sz w:val="21"/>
+          <w:szCs w:val="21"/>
+        </w:rPr>
+      </w:pPr>
+      <w:r>
+        <w:rPr>
+          <w:sz w:val="21"/>
+          <w:szCs w:val="21"/>
+        </w:rPr>
+        <w:t xml:space="preserve">Implemented booking conflict validation, inter-service communication using </w:t>
+      </w:r>
+      <w:proofErr w:type="spellStart"/>
+      <w:r>
+        <w:rPr>
+          <w:sz w:val="21"/>
+          <w:szCs w:val="21"/>
+        </w:rPr>
+        <w:t>OpenFeign</w:t>
+      </w:r>
+      <w:proofErr w:type="spellEnd"/>
+      <w:r>
+        <w:rPr>
+          <w:sz w:val="21"/>
+          <w:szCs w:val="21"/>
+        </w:rPr>
+        <w:t>, and Kafka-based asynchronous notifications</w:t>
+      </w:r>
+      <w:r>
+        <w:rPr>
+          <w:sz w:val="21"/>
+          <w:szCs w:val="21"/>
+        </w:rPr>
+        <w:t>.</w:t>
       </w:r>
     </w:p>
     <w:p>
       <w:pPr>
-        <w:pStyle w:val="ListParagraph"/>
         <w:numPr>
           <w:ilvl w:val="0"/>
-          <w:numId w:val="5"/>
+          <w:numId w:val="13"/>
         </w:numPr>
-        <w:spacing w:line="240" w:lineRule="auto"/>
-        <w:rPr>
-          <w:rFonts w:cstheme="minorHAnsi"/>
-          <w:sz w:val="22"/>
-          <w:szCs w:val="22"/>
-        </w:rPr>
-      </w:pPr>
-      <w:r>
-        <w:rPr>
-          <w:rFonts w:cstheme="minorHAnsi"/>
-          <w:sz w:val="22"/>
-          <w:szCs w:val="22"/>
-        </w:rPr>
-        <w:t>Improved performance and scalability with Redis caching, optimized database design, and Dockerized deployment.</w:t>
+        <w:spacing w:after="0" w:line="240" w:lineRule="auto"/>
+        <w:rPr>
+          <w:sz w:val="21"/>
+          <w:szCs w:val="21"/>
+        </w:rPr>
+      </w:pPr>
+      <w:r>
+        <w:rPr>
+          <w:sz w:val="21"/>
+          <w:szCs w:val="21"/>
+        </w:rPr>
+        <w:t>Used PostgreSQL with database-per-service architecture and containerized the system using Docker Compose</w:t>
+      </w:r>
+      <w:r>
+        <w:rPr>
+          <w:sz w:val="21"/>
+          <w:szCs w:val="21"/>
+        </w:rPr>
+        <w:t>.</w:t>
       </w:r>
     </w:p>
     <w:p>
       <w:pPr>
+        <w:numPr>
+          <w:ilvl w:val="0"/>
+          <w:numId w:val="13"/>
+        </w:numPr>
+        <w:spacing w:after="0" w:line="240" w:lineRule="auto"/>
+        <w:rPr>
+          <w:sz w:val="21"/>
+          <w:szCs w:val="21"/>
+        </w:rPr>
+      </w:pPr>
+      <w:r>
+        <w:rPr>
+          <w:sz w:val="21"/>
+          <w:szCs w:val="21"/>
+        </w:rPr>
+        <w:t>Integrated Swagger/</w:t>
+      </w:r>
+      <w:proofErr w:type="spellStart"/>
+      <w:r>
+        <w:rPr>
+          <w:sz w:val="21"/>
+          <w:szCs w:val="21"/>
+        </w:rPr>
+        <w:t>OpenAPI</w:t>
+      </w:r>
+      <w:proofErr w:type="spellEnd"/>
+      <w:r>
+        <w:rPr>
+          <w:sz w:val="21"/>
+          <w:szCs w:val="21"/>
+        </w:rPr>
+        <w:t xml:space="preserve"> and Spring Boot Actuator for API documentation and application monitoring</w:t>
+      </w:r>
+      <w:r>
+        <w:rPr>
+          <w:sz w:val="21"/>
+          <w:szCs w:val="21"/>
+        </w:rPr>
+        <w:t>.</w:t>
+      </w:r>
+    </w:p>
+    <w:p>
+      <w:pPr>
+        <w:spacing w:after="0" w:line="240" w:lineRule="auto"/>
+        <w:rPr>
+          <w:sz w:val="21"/>
+          <w:szCs w:val="21"/>
+        </w:rPr>
+      </w:pPr>
+    </w:p>
+    <w:p>
+      <w:pPr>
         <w:spacing w:line="240" w:lineRule="auto"/>
         <w:rPr>
-          <w:rFonts w:cstheme="minorHAnsi"/>
-          <w:sz w:val="22"/>
-          <w:szCs w:val="22"/>
-        </w:rPr>
-      </w:pPr>
-      <w:r>
-        <w:rPr>
-          <w:rFonts w:cstheme="minorHAnsi"/>
           <w:b/>
           <w:bCs/>
-        </w:rPr>
-        <w:t>FinStream</w:t>
-      </w:r>
-      <w:r>
-        <w:rPr>
-          <w:rFonts w:cstheme="minorHAnsi"/>
-          <w:sz w:val="22"/>
-          <w:szCs w:val="22"/>
-        </w:rPr>
-        <w:t xml:space="preserve"> | Java 17, Spring Boot 3, Java Streams, REST APIs, Docker, Render | </w:t>
-      </w:r>
-      <w:hyperlink r:id="rId10" w:history="1">
+          <w:sz w:val="21"/>
+          <w:szCs w:val="21"/>
+        </w:rPr>
+      </w:pPr>
+      <w:r>
+        <w:rPr>
+          <w:b/>
+          <w:bCs/>
+          <w:sz w:val="21"/>
+          <w:szCs w:val="21"/>
+        </w:rPr>
+        <w:t xml:space="preserve">EMI Planner (Loan Atlas) </w:t>
+      </w:r>
+      <w:r>
+        <w:rPr>
+          <w:sz w:val="21"/>
+          <w:szCs w:val="21"/>
+        </w:rPr>
+        <w:t xml:space="preserve">| Java 17, Spring Boot 3, Spring Security, MySQL, Redis, Docker | </w:t>
+      </w:r>
+      <w:hyperlink r:id="rId6" w:history="1">
         <w:r>
           <w:rPr>
             <w:rStyle w:val="Hyperlink"/>
-            <w:rFonts w:cstheme="minorHAnsi"/>
-            <w:sz w:val="22"/>
-            <w:szCs w:val="22"/>
+            <w:sz w:val="21"/>
+            <w:szCs w:val="21"/>
           </w:rPr>
           <w:t>GitHub</w:t>
         </w:r>
@@ -1040,122 +973,345 @@
     </w:p>
     <w:p>
       <w:pPr>
-        <w:pStyle w:val="ListParagraph"/>
         <w:numPr>
           <w:ilvl w:val="0"/>
-          <w:numId w:val="6"/>
+          <w:numId w:val="14"/>
         </w:numPr>
-        <w:spacing w:line="240" w:lineRule="auto"/>
-        <w:rPr>
-          <w:rFonts w:cstheme="minorHAnsi"/>
-          <w:sz w:val="22"/>
-          <w:szCs w:val="22"/>
-        </w:rPr>
-      </w:pPr>
-      <w:r>
-        <w:rPr>
-          <w:rFonts w:cstheme="minorHAnsi"/>
-          <w:sz w:val="22"/>
-          <w:szCs w:val="22"/>
-        </w:rPr>
-        <w:t>Built a financial analytics web app that processes CSV transaction data and delivers real-time insights on income, expenses, spending categories, and monthly trends.</w:t>
+        <w:spacing w:after="0" w:line="240" w:lineRule="auto"/>
+        <w:rPr>
+          <w:sz w:val="21"/>
+          <w:szCs w:val="21"/>
+        </w:rPr>
+      </w:pPr>
+      <w:r>
+        <w:rPr>
+          <w:sz w:val="21"/>
+          <w:szCs w:val="21"/>
+        </w:rPr>
+        <w:t>Built a loan management backend application using Spring Boot, Spring Security, MySQL, and Redis</w:t>
+      </w:r>
+      <w:r>
+        <w:rPr>
+          <w:sz w:val="21"/>
+          <w:szCs w:val="21"/>
+        </w:rPr>
+        <w:t>.</w:t>
       </w:r>
     </w:p>
     <w:p>
       <w:pPr>
-        <w:pStyle w:val="ListParagraph"/>
         <w:numPr>
           <w:ilvl w:val="0"/>
-          <w:numId w:val="6"/>
+          <w:numId w:val="14"/>
         </w:numPr>
-        <w:spacing w:line="240" w:lineRule="auto"/>
-        <w:rPr>
-          <w:rFonts w:cstheme="minorHAnsi"/>
-          <w:sz w:val="22"/>
-          <w:szCs w:val="22"/>
-        </w:rPr>
-      </w:pPr>
-      <w:r>
-        <w:rPr>
-          <w:rFonts w:cstheme="minorHAnsi"/>
-          <w:sz w:val="22"/>
-          <w:szCs w:val="22"/>
-        </w:rPr>
-        <w:t>Developed a stateless in-memory analytics engine using Java Streams and BigDecimal for fast, precision-safe financial calculations with robust validation and error handling</w:t>
+        <w:spacing w:after="0" w:line="240" w:lineRule="auto"/>
+        <w:rPr>
+          <w:sz w:val="21"/>
+          <w:szCs w:val="21"/>
+        </w:rPr>
+      </w:pPr>
+      <w:r>
+        <w:rPr>
+          <w:sz w:val="21"/>
+          <w:szCs w:val="21"/>
+        </w:rPr>
+        <w:t>Implemented JWT-based authentication and user-scoped access control for secure loan management operations</w:t>
+      </w:r>
+      <w:r>
+        <w:rPr>
+          <w:sz w:val="21"/>
+          <w:szCs w:val="21"/>
+        </w:rPr>
+        <w:t>.</w:t>
       </w:r>
     </w:p>
     <w:p>
       <w:pPr>
-        <w:pStyle w:val="ListParagraph"/>
         <w:numPr>
           <w:ilvl w:val="0"/>
-          <w:numId w:val="6"/>
+          <w:numId w:val="14"/>
         </w:numPr>
-        <w:spacing w:line="240" w:lineRule="auto"/>
-        <w:rPr>
-          <w:rFonts w:cstheme="minorHAnsi"/>
-          <w:sz w:val="22"/>
-          <w:szCs w:val="22"/>
-        </w:rPr>
-      </w:pPr>
-      <w:r>
-        <w:rPr>
-          <w:rFonts w:cstheme="minorHAnsi"/>
-          <w:sz w:val="22"/>
-          <w:szCs w:val="22"/>
-        </w:rPr>
-        <w:t>Dockerized and deployed the application on Render using a multi-stage build for lightweight, production-ready hosting.</w:t>
+        <w:spacing w:after="0" w:line="240" w:lineRule="auto"/>
+        <w:rPr>
+          <w:sz w:val="21"/>
+          <w:szCs w:val="21"/>
+        </w:rPr>
+      </w:pPr>
+      <w:r>
+        <w:rPr>
+          <w:sz w:val="21"/>
+          <w:szCs w:val="21"/>
+        </w:rPr>
+        <w:t>Developed Redis caching for frequently accessed endpoints and used indexing strategies to improve query performance</w:t>
+      </w:r>
+      <w:r>
+        <w:rPr>
+          <w:sz w:val="21"/>
+          <w:szCs w:val="21"/>
+        </w:rPr>
+        <w:t>.</w:t>
       </w:r>
     </w:p>
     <w:p>
       <w:pPr>
-        <w:spacing w:line="240" w:lineRule="auto"/>
-        <w:rPr>
-          <w:rFonts w:cstheme="minorHAnsi"/>
-          <w:sz w:val="22"/>
-          <w:szCs w:val="22"/>
-        </w:rPr>
-      </w:pPr>
-      <w:r>
-        <w:rPr>
-          <w:rFonts w:cstheme="minorHAnsi"/>
-          <w:sz w:val="21"/>
-          <w:szCs w:val="21"/>
-          <w:lang w:val="it-IT"/>
-        </w:rPr>
-        <w:pict w14:anchorId="282649BE">
-          <v:rect id="_x0000_i1043" style="width:0;height:1.5pt" o:hralign="center" o:hrstd="t" o:hr="t" fillcolor="#a0a0a0" stroked="f"/>
-        </w:pict>
+        <w:numPr>
+          <w:ilvl w:val="0"/>
+          <w:numId w:val="14"/>
+        </w:numPr>
+        <w:spacing w:after="0" w:line="240" w:lineRule="auto"/>
+        <w:rPr>
+          <w:sz w:val="21"/>
+          <w:szCs w:val="21"/>
+        </w:rPr>
+      </w:pPr>
+      <w:r>
+        <w:rPr>
+          <w:sz w:val="21"/>
+          <w:szCs w:val="21"/>
+        </w:rPr>
+        <w:t xml:space="preserve">Added centralized exception handling and validation for reliable API </w:t>
+      </w:r>
+      <w:r>
+        <w:rPr>
+          <w:sz w:val="21"/>
+          <w:szCs w:val="21"/>
+        </w:rPr>
+        <w:t>behaviour</w:t>
+      </w:r>
+      <w:r>
+        <w:rPr>
+          <w:sz w:val="21"/>
+          <w:szCs w:val="21"/>
+        </w:rPr>
+        <w:t>.</w:t>
       </w:r>
     </w:p>
     <w:p>
       <w:pPr>
+        <w:spacing w:after="0" w:line="240" w:lineRule="auto"/>
+        <w:rPr>
+          <w:sz w:val="21"/>
+          <w:szCs w:val="21"/>
+        </w:rPr>
+      </w:pPr>
+    </w:p>
+    <w:p>
+      <w:pPr>
         <w:spacing w:line="240" w:lineRule="auto"/>
         <w:rPr>
-          <w:rFonts w:cstheme="minorHAnsi"/>
           <w:b/>
           <w:bCs/>
-        </w:rPr>
-      </w:pPr>
-      <w:r>
-        <w:rPr>
-          <w:rFonts w:cstheme="minorHAnsi"/>
+          <w:sz w:val="21"/>
+          <w:szCs w:val="21"/>
+        </w:rPr>
+      </w:pPr>
+      <w:proofErr w:type="spellStart"/>
+      <w:r>
+        <w:rPr>
           <w:b/>
           <w:bCs/>
-        </w:rPr>
-        <w:t>Education:</w:t>
-      </w:r>
+          <w:sz w:val="21"/>
+          <w:szCs w:val="21"/>
+        </w:rPr>
+        <w:t>FinStream</w:t>
+      </w:r>
+      <w:proofErr w:type="spellEnd"/>
+      <w:r>
+        <w:rPr>
+          <w:b/>
+          <w:bCs/>
+          <w:sz w:val="21"/>
+          <w:szCs w:val="21"/>
+        </w:rPr>
+        <w:t xml:space="preserve"> </w:t>
+      </w:r>
+      <w:r>
+        <w:rPr>
+          <w:sz w:val="21"/>
+          <w:szCs w:val="21"/>
+        </w:rPr>
+        <w:t xml:space="preserve">| Java 17, Spring Boot 3, Java Streams, REST APIs, Docker, Render | </w:t>
+      </w:r>
+      <w:hyperlink r:id="rId7" w:history="1">
+        <w:r>
+          <w:rPr>
+            <w:rStyle w:val="Hyperlink"/>
+            <w:sz w:val="21"/>
+            <w:szCs w:val="21"/>
+          </w:rPr>
+          <w:t>GitHub</w:t>
+        </w:r>
+      </w:hyperlink>
+      <w:r>
+        <w:rPr>
+          <w:sz w:val="21"/>
+          <w:szCs w:val="21"/>
+        </w:rPr>
+        <w:t xml:space="preserve"> | </w:t>
+      </w:r>
+      <w:hyperlink r:id="rId8" w:history="1">
+        <w:r>
+          <w:rPr>
+            <w:rStyle w:val="Hyperlink"/>
+            <w:sz w:val="21"/>
+            <w:szCs w:val="21"/>
+          </w:rPr>
+          <w:t>Live</w:t>
+        </w:r>
+      </w:hyperlink>
     </w:p>
     <w:p>
       <w:pPr>
-        <w:pStyle w:val="ListParagraph"/>
         <w:numPr>
           <w:ilvl w:val="0"/>
-          <w:numId w:val="7"/>
+          <w:numId w:val="15"/>
         </w:numPr>
+        <w:spacing w:after="0" w:line="240" w:lineRule="auto"/>
+        <w:jc w:val="both"/>
+        <w:rPr>
+          <w:sz w:val="21"/>
+          <w:szCs w:val="21"/>
+        </w:rPr>
+      </w:pPr>
+      <w:r>
+        <w:rPr>
+          <w:sz w:val="21"/>
+          <w:szCs w:val="21"/>
+        </w:rPr>
+        <w:t>Built a backend analytics application that processes uploaded CSV transaction data and generates categorized financial insights</w:t>
+      </w:r>
+      <w:r>
+        <w:rPr>
+          <w:sz w:val="21"/>
+          <w:szCs w:val="21"/>
+        </w:rPr>
+        <w:t>.</w:t>
+      </w:r>
+    </w:p>
+    <w:p>
+      <w:pPr>
+        <w:numPr>
+          <w:ilvl w:val="0"/>
+          <w:numId w:val="15"/>
+        </w:numPr>
+        <w:spacing w:after="0" w:line="240" w:lineRule="auto"/>
+        <w:jc w:val="both"/>
+        <w:rPr>
+          <w:sz w:val="21"/>
+          <w:szCs w:val="21"/>
+        </w:rPr>
+      </w:pPr>
+      <w:r>
+        <w:rPr>
+          <w:sz w:val="21"/>
+          <w:szCs w:val="21"/>
+        </w:rPr>
+        <w:t xml:space="preserve">Implemented transaction aggregation and analytics using Java Streams and </w:t>
+      </w:r>
+      <w:proofErr w:type="spellStart"/>
+      <w:r>
+        <w:rPr>
+          <w:sz w:val="21"/>
+          <w:szCs w:val="21"/>
+        </w:rPr>
+        <w:t>BigDecimal</w:t>
+      </w:r>
+      <w:proofErr w:type="spellEnd"/>
+      <w:r>
+        <w:rPr>
+          <w:sz w:val="21"/>
+          <w:szCs w:val="21"/>
+        </w:rPr>
+        <w:t xml:space="preserve"> for precision-safe calculations</w:t>
+      </w:r>
+      <w:r>
+        <w:rPr>
+          <w:sz w:val="21"/>
+          <w:szCs w:val="21"/>
+        </w:rPr>
+        <w:t>.</w:t>
+      </w:r>
+    </w:p>
+    <w:p>
+      <w:pPr>
+        <w:numPr>
+          <w:ilvl w:val="0"/>
+          <w:numId w:val="15"/>
+        </w:numPr>
+        <w:spacing w:after="0" w:line="240" w:lineRule="auto"/>
+        <w:jc w:val="both"/>
+        <w:rPr>
+          <w:sz w:val="21"/>
+          <w:szCs w:val="21"/>
+        </w:rPr>
+      </w:pPr>
+      <w:r>
+        <w:rPr>
+          <w:sz w:val="21"/>
+          <w:szCs w:val="21"/>
+        </w:rPr>
+        <w:t>Developed REST APIs for file upload and analytics generation without database dependency</w:t>
+      </w:r>
+      <w:r>
+        <w:rPr>
+          <w:sz w:val="21"/>
+          <w:szCs w:val="21"/>
+        </w:rPr>
+        <w:t>.</w:t>
+      </w:r>
+    </w:p>
+    <w:p>
+      <w:pPr>
+        <w:numPr>
+          <w:ilvl w:val="0"/>
+          <w:numId w:val="15"/>
+        </w:numPr>
+        <w:spacing w:after="0" w:line="240" w:lineRule="auto"/>
+        <w:jc w:val="both"/>
+        <w:rPr>
+          <w:sz w:val="21"/>
+          <w:szCs w:val="21"/>
+        </w:rPr>
+      </w:pPr>
+      <w:r>
+        <w:rPr>
+          <w:sz w:val="21"/>
+          <w:szCs w:val="21"/>
+        </w:rPr>
+        <w:t>Containerized and deployed the application using Docker and Render</w:t>
+      </w:r>
+      <w:r>
+        <w:rPr>
+          <w:sz w:val="21"/>
+          <w:szCs w:val="21"/>
+        </w:rPr>
+        <w:t>.</w:t>
+      </w:r>
+    </w:p>
+    <w:p>
+      <w:pPr>
         <w:spacing w:line="240" w:lineRule="auto"/>
         <w:rPr>
+          <w:sz w:val="20"/>
+          <w:szCs w:val="20"/>
+        </w:rPr>
+      </w:pPr>
+      <w:r>
+        <w:rPr>
           <w:rFonts w:cstheme="minorHAnsi"/>
+          <w:sz w:val="19"/>
+          <w:szCs w:val="19"/>
+          <w:lang w:val="it-IT"/>
+        </w:rPr>
+        <w:pict w14:anchorId="4D11A7C6">
+          <v:rect id="_x0000_i1029" style="width:0;height:1.5pt" o:hralign="center" o:hrstd="t" o:hr="t" fillcolor="#a0a0a0" stroked="f"/>
+        </w:pict>
+      </w:r>
+    </w:p>
+    <w:p>
+      <w:pPr>
+        <w:spacing w:after="0" w:line="240" w:lineRule="auto"/>
+        <w:rPr>
           <w:b/>
           <w:bCs/>
           <w:sz w:val="20"/>
@@ -1164,79 +1320,95 @@
       </w:pPr>
       <w:r>
         <w:rPr>
-          <w:rFonts w:cstheme="minorHAnsi"/>
           <w:b/>
           <w:bCs/>
           <w:sz w:val="20"/>
           <w:szCs w:val="20"/>
         </w:rPr>
-        <w:t>Scaler Academy | Sept 2024 – present</w:t>
-      </w:r>
-      <w:r>
-        <w:rPr>
-          <w:rFonts w:cstheme="minorHAnsi"/>
+        <w:t>EDUCATION</w:t>
+      </w:r>
+      <w:r>
+        <w:rPr>
           <w:b/>
           <w:bCs/>
-        </w:rPr>
-        <w:t xml:space="preserve"> </w:t>
-      </w:r>
-      <w:r>
-        <w:rPr>
-          <w:rFonts w:cstheme="minorHAnsi"/>
+          <w:sz w:val="22"/>
+          <w:szCs w:val="22"/>
+        </w:rPr>
+        <w:br/>
+      </w:r>
+      <w:r>
+        <w:rPr>
           <w:sz w:val="20"/>
           <w:szCs w:val="20"/>
         </w:rPr>
-        <w:t>– Software Development – Backend Specialization</w:t>
-      </w:r>
-    </w:p>
-    <w:p>
-      <w:pPr>
-        <w:pStyle w:val="ListParagraph"/>
-        <w:numPr>
-          <w:ilvl w:val="0"/>
-          <w:numId w:val="7"/>
-        </w:numPr>
-        <w:spacing w:line="240" w:lineRule="auto"/>
-        <w:rPr>
-          <w:rFonts w:cstheme="minorHAnsi"/>
+        <w:t xml:space="preserve">Scaler Academy | Sept 2024 – Present </w:t>
+      </w:r>
+      <w:r>
+        <w:rPr>
+          <w:sz w:val="20"/>
+          <w:szCs w:val="20"/>
+        </w:rPr>
+        <w:t xml:space="preserve">| </w:t>
+      </w:r>
+      <w:r>
+        <w:rPr>
+          <w:sz w:val="20"/>
+          <w:szCs w:val="20"/>
+        </w:rPr>
+        <w:t>Software Development — Backend Specializatio</w:t>
+      </w:r>
+      <w:r>
+        <w:rPr>
+          <w:sz w:val="20"/>
+          <w:szCs w:val="20"/>
+        </w:rPr>
+        <w:t>n</w:t>
+      </w:r>
+      <w:r>
+        <w:rPr>
           <w:b/>
           <w:bCs/>
           <w:sz w:val="20"/>
           <w:szCs w:val="20"/>
         </w:rPr>
-      </w:pPr>
-      <w:r>
-        <w:rPr>
-          <w:rFonts w:cstheme="minorHAnsi"/>
-          <w:b/>
-          <w:bCs/>
+        <w:br/>
+      </w:r>
+      <w:r>
+        <w:rPr>
           <w:sz w:val="20"/>
           <w:szCs w:val="20"/>
         </w:rPr>
-        <w:t xml:space="preserve">Hindustan University | 2018 – 2022 - </w:t>
-      </w:r>
-      <w:r>
-        <w:rPr>
-          <w:rFonts w:cstheme="minorHAnsi"/>
+        <w:t xml:space="preserve">Hindustan University | 2018 – 2022 </w:t>
+      </w:r>
+      <w:r>
+        <w:rPr>
           <w:sz w:val="20"/>
           <w:szCs w:val="20"/>
         </w:rPr>
+        <w:t xml:space="preserve">| </w:t>
+      </w:r>
+      <w:proofErr w:type="spellStart"/>
+      <w:proofErr w:type="gramStart"/>
+      <w:r>
+        <w:rPr>
+          <w:sz w:val="20"/>
+          <w:szCs w:val="20"/>
+        </w:rPr>
         <w:t>B.Tech</w:t>
       </w:r>
-    </w:p>
-    <w:p>
-      <w:pPr>
-        <w:spacing w:line="240" w:lineRule="auto"/>
-        <w:rPr>
-          <w:rFonts w:cstheme="minorHAnsi"/>
-          <w:sz w:val="22"/>
-          <w:szCs w:val="22"/>
-        </w:rPr>
-      </w:pPr>
+      <w:proofErr w:type="spellEnd"/>
+      <w:proofErr w:type="gramEnd"/>
+      <w:r>
+        <w:rPr>
+          <w:sz w:val="20"/>
+          <w:szCs w:val="20"/>
+        </w:rPr>
+        <w:t xml:space="preserve"> — Automobile Engineering</w:t>
+      </w:r>
     </w:p>
     <w:sectPr>
-      <w:pgSz w:w="12240" w:h="20160" w:code="5"/>
-      <w:pgMar w:top="397" w:right="397" w:bottom="397" w:left="397" w:header="709" w:footer="709" w:gutter="0"/>
+      <w:pgSz w:w="11906" w:h="16838"/>
+      <w:pgMar w:top="284" w:right="284" w:bottom="284" w:left="284" w:header="709" w:footer="709" w:gutter="0"/>
       <w:cols w:space="708"/>
       <w:docGrid w:linePitch="360"/>
     </w:sectPr>
@@ -1586,6 +1758,381 @@
     </w:lvl>
   </w:abstractNum>
   <w:abstractNum w:abstractNumId="3" w15:restartNumberingAfterBreak="0">
+    <w:nsid w:val="2FC26E27"/>
+    <w:multiLevelType w:val="multilevel"/>
+    <w:tmpl w:val="14B24CE4"/>
+    <w:lvl w:ilvl="0">
+      <w:start w:val="1"/>
+      <w:numFmt w:val="bullet"/>
+      <w:lvlText w:val=""/>
+      <w:lvlJc w:val="left"/>
+      <w:pPr>
+        <w:tabs>
+          <w:tab w:val="num" w:pos="720"/>
+        </w:tabs>
+        <w:ind w:left="720" w:hanging="360"/>
+      </w:pPr>
+      <w:rPr>
+        <w:rFonts w:ascii="Symbol" w:hAnsi="Symbol" w:hint="default"/>
+        <w:sz w:val="20"/>
+      </w:rPr>
+    </w:lvl>
+    <w:lvl w:ilvl="1" w:tentative="1">
+      <w:start w:val="1"/>
+      <w:numFmt w:val="bullet"/>
+      <w:lvlText w:val="o"/>
+      <w:lvlJc w:val="left"/>
+      <w:pPr>
+        <w:tabs>
+          <w:tab w:val="num" w:pos="1440"/>
+        </w:tabs>
+        <w:ind w:left="1440" w:hanging="360"/>
+      </w:pPr>
+      <w:rPr>
+        <w:rFonts w:ascii="Courier New" w:hAnsi="Courier New" w:hint="default"/>
+        <w:sz w:val="20"/>
+      </w:rPr>
+    </w:lvl>
+    <w:lvl w:ilvl="2" w:tentative="1">
+      <w:start w:val="1"/>
+      <w:numFmt w:val="bullet"/>
+      <w:lvlText w:val=""/>
+      <w:lvlJc w:val="left"/>
+      <w:pPr>
+        <w:tabs>
+          <w:tab w:val="num" w:pos="2160"/>
+        </w:tabs>
+        <w:ind w:left="2160" w:hanging="360"/>
+      </w:pPr>
+      <w:rPr>
+        <w:rFonts w:ascii="Wingdings" w:hAnsi="Wingdings" w:hint="default"/>
+        <w:sz w:val="20"/>
+      </w:rPr>
+    </w:lvl>
+    <w:lvl w:ilvl="3" w:tentative="1">
+      <w:start w:val="1"/>
+      <w:numFmt w:val="bullet"/>
+      <w:lvlText w:val=""/>
+      <w:lvlJc w:val="left"/>
+      <w:pPr>
+        <w:tabs>
+          <w:tab w:val="num" w:pos="2880"/>
+        </w:tabs>
+        <w:ind w:left="2880" w:hanging="360"/>
+      </w:pPr>
+      <w:rPr>
+        <w:rFonts w:ascii="Wingdings" w:hAnsi="Wingdings" w:hint="default"/>
+        <w:sz w:val="20"/>
+      </w:rPr>
+    </w:lvl>
+    <w:lvl w:ilvl="4" w:tentative="1">
+      <w:start w:val="1"/>
+      <w:numFmt w:val="bullet"/>
+      <w:lvlText w:val=""/>
+      <w:lvlJc w:val="left"/>
+      <w:pPr>
+        <w:tabs>
+          <w:tab w:val="num" w:pos="3600"/>
+        </w:tabs>
+        <w:ind w:left="3600" w:hanging="360"/>
+      </w:pPr>
+      <w:rPr>
+        <w:rFonts w:ascii="Wingdings" w:hAnsi="Wingdings" w:hint="default"/>
+        <w:sz w:val="20"/>
+      </w:rPr>
+    </w:lvl>
+    <w:lvl w:ilvl="5" w:tentative="1">
+      <w:start w:val="1"/>
+      <w:numFmt w:val="bullet"/>
+      <w:lvlText w:val=""/>
+      <w:lvlJc w:val="left"/>
+      <w:pPr>
+        <w:tabs>
+          <w:tab w:val="num" w:pos="4320"/>
+        </w:tabs>
+        <w:ind w:left="4320" w:hanging="360"/>
+      </w:pPr>
+      <w:rPr>
+        <w:rFonts w:ascii="Wingdings" w:hAnsi="Wingdings" w:hint="default"/>
+        <w:sz w:val="20"/>
+      </w:rPr>
+    </w:lvl>
+    <w:lvl w:ilvl="6" w:tentative="1">
+      <w:start w:val="1"/>
+      <w:numFmt w:val="bullet"/>
+      <w:lvlText w:val=""/>
+      <w:lvlJc w:val="left"/>
+      <w:pPr>
+        <w:tabs>
+          <w:tab w:val="num" w:pos="5040"/>
+        </w:tabs>
+        <w:ind w:left="5040" w:hanging="360"/>
+      </w:pPr>
+      <w:rPr>
+        <w:rFonts w:ascii="Wingdings" w:hAnsi="Wingdings" w:hint="default"/>
+        <w:sz w:val="20"/>
+      </w:rPr>
+    </w:lvl>
+    <w:lvl w:ilvl="7" w:tentative="1">
+      <w:start w:val="1"/>
+      <w:numFmt w:val="bullet"/>
+      <w:lvlText w:val=""/>
+      <w:lvlJc w:val="left"/>
+      <w:pPr>
+        <w:tabs>
+          <w:tab w:val="num" w:pos="5760"/>
+        </w:tabs>
+        <w:ind w:left="5760" w:hanging="360"/>
+      </w:pPr>
+      <w:rPr>
+        <w:rFonts w:ascii="Wingdings" w:hAnsi="Wingdings" w:hint="default"/>
+        <w:sz w:val="20"/>
+      </w:rPr>
+    </w:lvl>
+    <w:lvl w:ilvl="8" w:tentative="1">
+      <w:start w:val="1"/>
+      <w:numFmt w:val="bullet"/>
+      <w:lvlText w:val=""/>
+      <w:lvlJc w:val="left"/>
+      <w:pPr>
+        <w:tabs>
+          <w:tab w:val="num" w:pos="6480"/>
+        </w:tabs>
+        <w:ind w:left="6480" w:hanging="360"/>
+      </w:pPr>
+      <w:rPr>
+        <w:rFonts w:ascii="Wingdings" w:hAnsi="Wingdings" w:hint="default"/>
+        <w:sz w:val="20"/>
+      </w:rPr>
+    </w:lvl>
+  </w:abstractNum>
+  <w:abstractNum w:abstractNumId="4" w15:restartNumberingAfterBreak="0">
+    <w:nsid w:val="3ED23205"/>
+    <w:multiLevelType w:val="hybridMultilevel"/>
+    <w:tmpl w:val="41F49E06"/>
+    <w:lvl w:ilvl="0" w:tplc="40090001">
+      <w:start w:val="1"/>
+      <w:numFmt w:val="bullet"/>
+      <w:lvlText w:val=""/>
+      <w:lvlJc w:val="left"/>
+      <w:pPr>
+        <w:ind w:left="720" w:hanging="360"/>
+      </w:pPr>
+      <w:rPr>
+        <w:rFonts w:ascii="Symbol" w:hAnsi="Symbol" w:hint="default"/>
+      </w:rPr>
+    </w:lvl>
+    <w:lvl w:ilvl="1" w:tplc="40090003" w:tentative="1">
+      <w:start w:val="1"/>
+      <w:numFmt w:val="bullet"/>
+      <w:lvlText w:val="o"/>
+      <w:lvlJc w:val="left"/>
+      <w:pPr>
+        <w:ind w:left="1440" w:hanging="360"/>
+      </w:pPr>
+      <w:rPr>
+        <w:rFonts w:ascii="Courier New" w:hAnsi="Courier New" w:cs="Courier New" w:hint="default"/>
+      </w:rPr>
+    </w:lvl>
+    <w:lvl w:ilvl="2" w:tplc="40090005" w:tentative="1">
+      <w:start w:val="1"/>
+      <w:numFmt w:val="bullet"/>
+      <w:lvlText w:val=""/>
+      <w:lvlJc w:val="left"/>
+      <w:pPr>
+        <w:ind w:left="2160" w:hanging="360"/>
+      </w:pPr>
+      <w:rPr>
+        <w:rFonts w:ascii="Wingdings" w:hAnsi="Wingdings" w:hint="default"/>
+      </w:rPr>
+    </w:lvl>
+    <w:lvl w:ilvl="3" w:tplc="40090001" w:tentative="1">
+      <w:start w:val="1"/>
+      <w:numFmt w:val="bullet"/>
+      <w:lvlText w:val=""/>
+      <w:lvlJc w:val="left"/>
+      <w:pPr>
+        <w:ind w:left="2880" w:hanging="360"/>
+      </w:pPr>
+      <w:rPr>
+        <w:rFonts w:ascii="Symbol" w:hAnsi="Symbol" w:hint="default"/>
+      </w:rPr>
+    </w:lvl>
+    <w:lvl w:ilvl="4" w:tplc="40090003" w:tentative="1">
+      <w:start w:val="1"/>
+      <w:numFmt w:val="bullet"/>
+      <w:lvlText w:val="o"/>
+      <w:lvlJc w:val="left"/>
+      <w:pPr>
+        <w:ind w:left="3600" w:hanging="360"/>
+      </w:pPr>
+      <w:rPr>
+        <w:rFonts w:ascii="Courier New" w:hAnsi="Courier New" w:cs="Courier New" w:hint="default"/>
+      </w:rPr>
+    </w:lvl>
+    <w:lvl w:ilvl="5" w:tplc="40090005" w:tentative="1">
+      <w:start w:val="1"/>
+      <w:numFmt w:val="bullet"/>
+      <w:lvlText w:val=""/>
+      <w:lvlJc w:val="left"/>
+      <w:pPr>
+        <w:ind w:left="4320" w:hanging="360"/>
+      </w:pPr>
+      <w:rPr>
+        <w:rFonts w:ascii="Wingdings" w:hAnsi="Wingdings" w:hint="default"/>
+      </w:rPr>
+    </w:lvl>
+    <w:lvl w:ilvl="6" w:tplc="40090001" w:tentative="1">
+      <w:start w:val="1"/>
+      <w:numFmt w:val="bullet"/>
+      <w:lvlText w:val=""/>
+      <w:lvlJc w:val="left"/>
+      <w:pPr>
+        <w:ind w:left="5040" w:hanging="360"/>
+      </w:pPr>
+      <w:rPr>
+        <w:rFonts w:ascii="Symbol" w:hAnsi="Symbol" w:hint="default"/>
+      </w:rPr>
+    </w:lvl>
+    <w:lvl w:ilvl="7" w:tplc="40090003" w:tentative="1">
+      <w:start w:val="1"/>
+      <w:numFmt w:val="bullet"/>
+      <w:lvlText w:val="o"/>
+      <w:lvlJc w:val="left"/>
+      <w:pPr>
+        <w:ind w:left="5760" w:hanging="360"/>
+      </w:pPr>
+      <w:rPr>
+        <w:rFonts w:ascii="Courier New" w:hAnsi="Courier New" w:cs="Courier New" w:hint="default"/>
+      </w:rPr>
+    </w:lvl>
+    <w:lvl w:ilvl="8" w:tplc="40090005" w:tentative="1">
+      <w:start w:val="1"/>
+      <w:numFmt w:val="bullet"/>
+      <w:lvlText w:val=""/>
+      <w:lvlJc w:val="left"/>
+      <w:pPr>
+        <w:ind w:left="6480" w:hanging="360"/>
+      </w:pPr>
+      <w:rPr>
+        <w:rFonts w:ascii="Wingdings" w:hAnsi="Wingdings" w:hint="default"/>
+      </w:rPr>
+    </w:lvl>
+  </w:abstractNum>
+  <w:abstractNum w:abstractNumId="5" w15:restartNumberingAfterBreak="0">
+    <w:nsid w:val="4B1D6721"/>
+    <w:multiLevelType w:val="hybridMultilevel"/>
+    <w:tmpl w:val="34260308"/>
+    <w:lvl w:ilvl="0" w:tplc="40090001">
+      <w:start w:val="1"/>
+      <w:numFmt w:val="bullet"/>
+      <w:lvlText w:val=""/>
+      <w:lvlJc w:val="left"/>
+      <w:pPr>
+        <w:ind w:left="720" w:hanging="360"/>
+      </w:pPr>
+      <w:rPr>
+        <w:rFonts w:ascii="Symbol" w:hAnsi="Symbol" w:hint="default"/>
+      </w:rPr>
+    </w:lvl>
+    <w:lvl w:ilvl="1" w:tplc="40090003" w:tentative="1">
+      <w:start w:val="1"/>
+      <w:numFmt w:val="bullet"/>
+      <w:lvlText w:val="o"/>
+      <w:lvlJc w:val="left"/>
+      <w:pPr>
+        <w:ind w:left="1440" w:hanging="360"/>
+      </w:pPr>
+      <w:rPr>
+        <w:rFonts w:ascii="Courier New" w:hAnsi="Courier New" w:cs="Courier New" w:hint="default"/>
+      </w:rPr>
+    </w:lvl>
+    <w:lvl w:ilvl="2" w:tplc="40090005" w:tentative="1">
+      <w:start w:val="1"/>
+      <w:numFmt w:val="bullet"/>
+      <w:lvlText w:val=""/>
+      <w:lvlJc w:val="left"/>
+      <w:pPr>
+        <w:ind w:left="2160" w:hanging="360"/>
+      </w:pPr>
+      <w:rPr>
+        <w:rFonts w:ascii="Wingdings" w:hAnsi="Wingdings" w:hint="default"/>
+      </w:rPr>
+    </w:lvl>
+    <w:lvl w:ilvl="3" w:tplc="40090001" w:tentative="1">
+      <w:start w:val="1"/>
+      <w:numFmt w:val="bullet"/>
+      <w:lvlText w:val=""/>
+      <w:lvlJc w:val="left"/>
+      <w:pPr>
+        <w:ind w:left="2880" w:hanging="360"/>
+      </w:pPr>
+      <w:rPr>
+        <w:rFonts w:ascii="Symbol" w:hAnsi="Symbol" w:hint="default"/>
+      </w:rPr>
+    </w:lvl>
+    <w:lvl w:ilvl="4" w:tplc="40090003" w:tentative="1">
+      <w:start w:val="1"/>
+      <w:numFmt w:val="bullet"/>
+      <w:lvlText w:val="o"/>
+      <w:lvlJc w:val="left"/>
+      <w:pPr>
+        <w:ind w:left="3600" w:hanging="360"/>
+      </w:pPr>
+      <w:rPr>
+        <w:rFonts w:ascii="Courier New" w:hAnsi="Courier New" w:cs="Courier New" w:hint="default"/>
+      </w:rPr>
+    </w:lvl>
+    <w:lvl w:ilvl="5" w:tplc="40090005" w:tentative="1">
+      <w:start w:val="1"/>
+      <w:numFmt w:val="bullet"/>
+      <w:lvlText w:val=""/>
+      <w:lvlJc w:val="left"/>
+      <w:pPr>
+        <w:ind w:left="4320" w:hanging="360"/>
+      </w:pPr>
+      <w:rPr>
+        <w:rFonts w:ascii="Wingdings" w:hAnsi="Wingdings" w:hint="default"/>
+      </w:rPr>
+    </w:lvl>
+    <w:lvl w:ilvl="6" w:tplc="40090001" w:tentative="1">
+      <w:start w:val="1"/>
+      <w:numFmt w:val="bullet"/>
+      <w:lvlText w:val=""/>
+      <w:lvlJc w:val="left"/>
+      <w:pPr>
+        <w:ind w:left="5040" w:hanging="360"/>
+      </w:pPr>
+      <w:rPr>
+        <w:rFonts w:ascii="Symbol" w:hAnsi="Symbol" w:hint="default"/>
+      </w:rPr>
+    </w:lvl>
+    <w:lvl w:ilvl="7" w:tplc="40090003" w:tentative="1">
+      <w:start w:val="1"/>
+      <w:numFmt w:val="bullet"/>
+      <w:lvlText w:val="o"/>
+      <w:lvlJc w:val="left"/>
+      <w:pPr>
+        <w:ind w:left="5760" w:hanging="360"/>
+      </w:pPr>
+      <w:rPr>
+        <w:rFonts w:ascii="Courier New" w:hAnsi="Courier New" w:cs="Courier New" w:hint="default"/>
+      </w:rPr>
+    </w:lvl>
+    <w:lvl w:ilvl="8" w:tplc="40090005" w:tentative="1">
+      <w:start w:val="1"/>
+      <w:numFmt w:val="bullet"/>
+      <w:lvlText w:val=""/>
+      <w:lvlJc w:val="left"/>
+      <w:pPr>
+        <w:ind w:left="6480" w:hanging="360"/>
+      </w:pPr>
+      <w:rPr>
+        <w:rFonts w:ascii="Wingdings" w:hAnsi="Wingdings" w:hint="default"/>
+      </w:rPr>
+    </w:lvl>
+  </w:abstractNum>
+  <w:abstractNum w:abstractNumId="6" w15:restartNumberingAfterBreak="0">
     <w:nsid w:val="521D69A4"/>
     <w:multiLevelType w:val="hybridMultilevel"/>
     <w:tmpl w:val="1B8E8DA0"/>
@@ -1698,7 +2245,531 @@
       </w:rPr>
     </w:lvl>
   </w:abstractNum>
-  <w:abstractNum w:abstractNumId="4" w15:restartNumberingAfterBreak="0">
+  <w:abstractNum w:abstractNumId="7" w15:restartNumberingAfterBreak="0">
+    <w:nsid w:val="603C305A"/>
+    <w:multiLevelType w:val="hybridMultilevel"/>
+    <w:tmpl w:val="4E5A3B26"/>
+    <w:lvl w:ilvl="0" w:tplc="40090001">
+      <w:start w:val="1"/>
+      <w:numFmt w:val="bullet"/>
+      <w:lvlText w:val=""/>
+      <w:lvlJc w:val="left"/>
+      <w:pPr>
+        <w:ind w:left="720" w:hanging="360"/>
+      </w:pPr>
+      <w:rPr>
+        <w:rFonts w:ascii="Symbol" w:hAnsi="Symbol" w:hint="default"/>
+      </w:rPr>
+    </w:lvl>
+    <w:lvl w:ilvl="1" w:tplc="40090003" w:tentative="1">
+      <w:start w:val="1"/>
+      <w:numFmt w:val="bullet"/>
+      <w:lvlText w:val="o"/>
+      <w:lvlJc w:val="left"/>
+      <w:pPr>
+        <w:ind w:left="1440" w:hanging="360"/>
+      </w:pPr>
+      <w:rPr>
+        <w:rFonts w:ascii="Courier New" w:hAnsi="Courier New" w:cs="Courier New" w:hint="default"/>
+      </w:rPr>
+    </w:lvl>
+    <w:lvl w:ilvl="2" w:tplc="40090005" w:tentative="1">
+      <w:start w:val="1"/>
+      <w:numFmt w:val="bullet"/>
+      <w:lvlText w:val=""/>
+      <w:lvlJc w:val="left"/>
+      <w:pPr>
+        <w:ind w:left="2160" w:hanging="360"/>
+      </w:pPr>
+      <w:rPr>
+        <w:rFonts w:ascii="Wingdings" w:hAnsi="Wingdings" w:hint="default"/>
+      </w:rPr>
+    </w:lvl>
+    <w:lvl w:ilvl="3" w:tplc="40090001" w:tentative="1">
+      <w:start w:val="1"/>
+      <w:numFmt w:val="bullet"/>
+      <w:lvlText w:val=""/>
+      <w:lvlJc w:val="left"/>
+      <w:pPr>
+        <w:ind w:left="2880" w:hanging="360"/>
+      </w:pPr>
+      <w:rPr>
+        <w:rFonts w:ascii="Symbol" w:hAnsi="Symbol" w:hint="default"/>
+      </w:rPr>
+    </w:lvl>
+    <w:lvl w:ilvl="4" w:tplc="40090003" w:tentative="1">
+      <w:start w:val="1"/>
+      <w:numFmt w:val="bullet"/>
+      <w:lvlText w:val="o"/>
+      <w:lvlJc w:val="left"/>
+      <w:pPr>
+        <w:ind w:left="3600" w:hanging="360"/>
+      </w:pPr>
+      <w:rPr>
+        <w:rFonts w:ascii="Courier New" w:hAnsi="Courier New" w:cs="Courier New" w:hint="default"/>
+      </w:rPr>
+    </w:lvl>
+    <w:lvl w:ilvl="5" w:tplc="40090005" w:tentative="1">
+      <w:start w:val="1"/>
+      <w:numFmt w:val="bullet"/>
+      <w:lvlText w:val=""/>
+      <w:lvlJc w:val="left"/>
+      <w:pPr>
+        <w:ind w:left="4320" w:hanging="360"/>
+      </w:pPr>
+      <w:rPr>
+        <w:rFonts w:ascii="Wingdings" w:hAnsi="Wingdings" w:hint="default"/>
+      </w:rPr>
+    </w:lvl>
+    <w:lvl w:ilvl="6" w:tplc="40090001" w:tentative="1">
+      <w:start w:val="1"/>
+      <w:numFmt w:val="bullet"/>
+      <w:lvlText w:val=""/>
+      <w:lvlJc w:val="left"/>
+      <w:pPr>
+        <w:ind w:left="5040" w:hanging="360"/>
+      </w:pPr>
+      <w:rPr>
+        <w:rFonts w:ascii="Symbol" w:hAnsi="Symbol" w:hint="default"/>
+      </w:rPr>
+    </w:lvl>
+    <w:lvl w:ilvl="7" w:tplc="40090003" w:tentative="1">
+      <w:start w:val="1"/>
+      <w:numFmt w:val="bullet"/>
+      <w:lvlText w:val="o"/>
+      <w:lvlJc w:val="left"/>
+      <w:pPr>
+        <w:ind w:left="5760" w:hanging="360"/>
+      </w:pPr>
+      <w:rPr>
+        <w:rFonts w:ascii="Courier New" w:hAnsi="Courier New" w:cs="Courier New" w:hint="default"/>
+      </w:rPr>
+    </w:lvl>
+    <w:lvl w:ilvl="8" w:tplc="40090005" w:tentative="1">
+      <w:start w:val="1"/>
+      <w:numFmt w:val="bullet"/>
+      <w:lvlText w:val=""/>
+      <w:lvlJc w:val="left"/>
+      <w:pPr>
+        <w:ind w:left="6480" w:hanging="360"/>
+      </w:pPr>
+      <w:rPr>
+        <w:rFonts w:ascii="Wingdings" w:hAnsi="Wingdings" w:hint="default"/>
+      </w:rPr>
+    </w:lvl>
+  </w:abstractNum>
+  <w:abstractNum w:abstractNumId="8" w15:restartNumberingAfterBreak="0">
+    <w:nsid w:val="6612067A"/>
+    <w:multiLevelType w:val="multilevel"/>
+    <w:tmpl w:val="689C9F1A"/>
+    <w:lvl w:ilvl="0">
+      <w:start w:val="1"/>
+      <w:numFmt w:val="bullet"/>
+      <w:lvlText w:val=""/>
+      <w:lvlJc w:val="left"/>
+      <w:pPr>
+        <w:tabs>
+          <w:tab w:val="num" w:pos="720"/>
+        </w:tabs>
+        <w:ind w:left="720" w:hanging="360"/>
+      </w:pPr>
+      <w:rPr>
+        <w:rFonts w:ascii="Symbol" w:hAnsi="Symbol" w:hint="default"/>
+        <w:sz w:val="20"/>
+      </w:rPr>
+    </w:lvl>
+    <w:lvl w:ilvl="1" w:tentative="1">
+      <w:start w:val="1"/>
+      <w:numFmt w:val="bullet"/>
+      <w:lvlText w:val="o"/>
+      <w:lvlJc w:val="left"/>
+      <w:pPr>
+        <w:tabs>
+          <w:tab w:val="num" w:pos="1440"/>
+        </w:tabs>
+        <w:ind w:left="1440" w:hanging="360"/>
+      </w:pPr>
+      <w:rPr>
+        <w:rFonts w:ascii="Courier New" w:hAnsi="Courier New" w:hint="default"/>
+        <w:sz w:val="20"/>
+      </w:rPr>
+    </w:lvl>
+    <w:lvl w:ilvl="2" w:tentative="1">
+      <w:start w:val="1"/>
+      <w:numFmt w:val="bullet"/>
+      <w:lvlText w:val=""/>
+      <w:lvlJc w:val="left"/>
+      <w:pPr>
+        <w:tabs>
+          <w:tab w:val="num" w:pos="2160"/>
+        </w:tabs>
+        <w:ind w:left="2160" w:hanging="360"/>
+      </w:pPr>
+      <w:rPr>
+        <w:rFonts w:ascii="Wingdings" w:hAnsi="Wingdings" w:hint="default"/>
+        <w:sz w:val="20"/>
+      </w:rPr>
+    </w:lvl>
+    <w:lvl w:ilvl="3" w:tentative="1">
+      <w:start w:val="1"/>
+      <w:numFmt w:val="bullet"/>
+      <w:lvlText w:val=""/>
+      <w:lvlJc w:val="left"/>
+      <w:pPr>
+        <w:tabs>
+          <w:tab w:val="num" w:pos="2880"/>
+        </w:tabs>
+        <w:ind w:left="2880" w:hanging="360"/>
+      </w:pPr>
+      <w:rPr>
+        <w:rFonts w:ascii="Wingdings" w:hAnsi="Wingdings" w:hint="default"/>
+        <w:sz w:val="20"/>
+      </w:rPr>
+    </w:lvl>
+    <w:lvl w:ilvl="4" w:tentative="1">
+      <w:start w:val="1"/>
+      <w:numFmt w:val="bullet"/>
+      <w:lvlText w:val=""/>
+      <w:lvlJc w:val="left"/>
+      <w:pPr>
+        <w:tabs>
+          <w:tab w:val="num" w:pos="3600"/>
+        </w:tabs>
+        <w:ind w:left="3600" w:hanging="360"/>
+      </w:pPr>
+      <w:rPr>
+        <w:rFonts w:ascii="Wingdings" w:hAnsi="Wingdings" w:hint="default"/>
+        <w:sz w:val="20"/>
+      </w:rPr>
+    </w:lvl>
+    <w:lvl w:ilvl="5" w:tentative="1">
+      <w:start w:val="1"/>
+      <w:numFmt w:val="bullet"/>
+      <w:lvlText w:val=""/>
+      <w:lvlJc w:val="left"/>
+      <w:pPr>
+        <w:tabs>
+          <w:tab w:val="num" w:pos="4320"/>
+        </w:tabs>
+        <w:ind w:left="4320" w:hanging="360"/>
+      </w:pPr>
+      <w:rPr>
+        <w:rFonts w:ascii="Wingdings" w:hAnsi="Wingdings" w:hint="default"/>
+        <w:sz w:val="20"/>
+      </w:rPr>
+    </w:lvl>
+    <w:lvl w:ilvl="6" w:tentative="1">
+      <w:start w:val="1"/>
+      <w:numFmt w:val="bullet"/>
+      <w:lvlText w:val=""/>
+      <w:lvlJc w:val="left"/>
+      <w:pPr>
+        <w:tabs>
+          <w:tab w:val="num" w:pos="5040"/>
+        </w:tabs>
+        <w:ind w:left="5040" w:hanging="360"/>
+      </w:pPr>
+      <w:rPr>
+        <w:rFonts w:ascii="Wingdings" w:hAnsi="Wingdings" w:hint="default"/>
+        <w:sz w:val="20"/>
+      </w:rPr>
+    </w:lvl>
+    <w:lvl w:ilvl="7" w:tentative="1">
+      <w:start w:val="1"/>
+      <w:numFmt w:val="bullet"/>
+      <w:lvlText w:val=""/>
+      <w:lvlJc w:val="left"/>
+      <w:pPr>
+        <w:tabs>
+          <w:tab w:val="num" w:pos="5760"/>
+        </w:tabs>
+        <w:ind w:left="5760" w:hanging="360"/>
+      </w:pPr>
+      <w:rPr>
+        <w:rFonts w:ascii="Wingdings" w:hAnsi="Wingdings" w:hint="default"/>
+        <w:sz w:val="20"/>
+      </w:rPr>
+    </w:lvl>
+    <w:lvl w:ilvl="8" w:tentative="1">
+      <w:start w:val="1"/>
+      <w:numFmt w:val="bullet"/>
+      <w:lvlText w:val=""/>
+      <w:lvlJc w:val="left"/>
+      <w:pPr>
+        <w:tabs>
+          <w:tab w:val="num" w:pos="6480"/>
+        </w:tabs>
+        <w:ind w:left="6480" w:hanging="360"/>
+      </w:pPr>
+      <w:rPr>
+        <w:rFonts w:ascii="Wingdings" w:hAnsi="Wingdings" w:hint="default"/>
+        <w:sz w:val="20"/>
+      </w:rPr>
+    </w:lvl>
+  </w:abstractNum>
+  <w:abstractNum w:abstractNumId="9" w15:restartNumberingAfterBreak="0">
+    <w:nsid w:val="684202DF"/>
+    <w:multiLevelType w:val="multilevel"/>
+    <w:tmpl w:val="C10EE642"/>
+    <w:lvl w:ilvl="0">
+      <w:start w:val="1"/>
+      <w:numFmt w:val="bullet"/>
+      <w:lvlText w:val=""/>
+      <w:lvlJc w:val="left"/>
+      <w:pPr>
+        <w:tabs>
+          <w:tab w:val="num" w:pos="720"/>
+        </w:tabs>
+        <w:ind w:left="720" w:hanging="360"/>
+      </w:pPr>
+      <w:rPr>
+        <w:rFonts w:ascii="Symbol" w:hAnsi="Symbol" w:hint="default"/>
+        <w:sz w:val="20"/>
+      </w:rPr>
+    </w:lvl>
+    <w:lvl w:ilvl="1" w:tentative="1">
+      <w:start w:val="1"/>
+      <w:numFmt w:val="bullet"/>
+      <w:lvlText w:val="o"/>
+      <w:lvlJc w:val="left"/>
+      <w:pPr>
+        <w:tabs>
+          <w:tab w:val="num" w:pos="1440"/>
+        </w:tabs>
+        <w:ind w:left="1440" w:hanging="360"/>
+      </w:pPr>
+      <w:rPr>
+        <w:rFonts w:ascii="Courier New" w:hAnsi="Courier New" w:hint="default"/>
+        <w:sz w:val="20"/>
+      </w:rPr>
+    </w:lvl>
+    <w:lvl w:ilvl="2" w:tentative="1">
+      <w:start w:val="1"/>
+      <w:numFmt w:val="bullet"/>
+      <w:lvlText w:val=""/>
+      <w:lvlJc w:val="left"/>
+      <w:pPr>
+        <w:tabs>
+          <w:tab w:val="num" w:pos="2160"/>
+        </w:tabs>
+        <w:ind w:left="2160" w:hanging="360"/>
+      </w:pPr>
+      <w:rPr>
+        <w:rFonts w:ascii="Wingdings" w:hAnsi="Wingdings" w:hint="default"/>
+        <w:sz w:val="20"/>
+      </w:rPr>
+    </w:lvl>
+    <w:lvl w:ilvl="3" w:tentative="1">
+      <w:start w:val="1"/>
+      <w:numFmt w:val="bullet"/>
+      <w:lvlText w:val=""/>
+      <w:lvlJc w:val="left"/>
+      <w:pPr>
+        <w:tabs>
+          <w:tab w:val="num" w:pos="2880"/>
+        </w:tabs>
+        <w:ind w:left="2880" w:hanging="360"/>
+      </w:pPr>
+      <w:rPr>
+        <w:rFonts w:ascii="Wingdings" w:hAnsi="Wingdings" w:hint="default"/>
+        <w:sz w:val="20"/>
+      </w:rPr>
+    </w:lvl>
+    <w:lvl w:ilvl="4" w:tentative="1">
+      <w:start w:val="1"/>
+      <w:numFmt w:val="bullet"/>
+      <w:lvlText w:val=""/>
+      <w:lvlJc w:val="left"/>
+      <w:pPr>
+        <w:tabs>
+          <w:tab w:val="num" w:pos="3600"/>
+        </w:tabs>
+        <w:ind w:left="3600" w:hanging="360"/>
+      </w:pPr>
+      <w:rPr>
+        <w:rFonts w:ascii="Wingdings" w:hAnsi="Wingdings" w:hint="default"/>
+        <w:sz w:val="20"/>
+      </w:rPr>
+    </w:lvl>
+    <w:lvl w:ilvl="5" w:tentative="1">
+      <w:start w:val="1"/>
+      <w:numFmt w:val="bullet"/>
+      <w:lvlText w:val=""/>
+      <w:lvlJc w:val="left"/>
+      <w:pPr>
+        <w:tabs>
+          <w:tab w:val="num" w:pos="4320"/>
+        </w:tabs>
+        <w:ind w:left="4320" w:hanging="360"/>
+      </w:pPr>
+      <w:rPr>
+        <w:rFonts w:ascii="Wingdings" w:hAnsi="Wingdings" w:hint="default"/>
+        <w:sz w:val="20"/>
+      </w:rPr>
+    </w:lvl>
+    <w:lvl w:ilvl="6" w:tentative="1">
+      <w:start w:val="1"/>
+      <w:numFmt w:val="bullet"/>
+      <w:lvlText w:val=""/>
+      <w:lvlJc w:val="left"/>
+      <w:pPr>
+        <w:tabs>
+          <w:tab w:val="num" w:pos="5040"/>
+        </w:tabs>
+        <w:ind w:left="5040" w:hanging="360"/>
+      </w:pPr>
+      <w:rPr>
+        <w:rFonts w:ascii="Wingdings" w:hAnsi="Wingdings" w:hint="default"/>
+        <w:sz w:val="20"/>
+      </w:rPr>
+    </w:lvl>
+    <w:lvl w:ilvl="7" w:tentative="1">
+      <w:start w:val="1"/>
+      <w:numFmt w:val="bullet"/>
+      <w:lvlText w:val=""/>
+      <w:lvlJc w:val="left"/>
+      <w:pPr>
+        <w:tabs>
+          <w:tab w:val="num" w:pos="5760"/>
+        </w:tabs>
+        <w:ind w:left="5760" w:hanging="360"/>
+      </w:pPr>
+      <w:rPr>
+        <w:rFonts w:ascii="Wingdings" w:hAnsi="Wingdings" w:hint="default"/>
+        <w:sz w:val="20"/>
+      </w:rPr>
+    </w:lvl>
+    <w:lvl w:ilvl="8" w:tentative="1">
+      <w:start w:val="1"/>
+      <w:numFmt w:val="bullet"/>
+      <w:lvlText w:val=""/>
+      <w:lvlJc w:val="left"/>
+      <w:pPr>
+        <w:tabs>
+          <w:tab w:val="num" w:pos="6480"/>
+        </w:tabs>
+        <w:ind w:left="6480" w:hanging="360"/>
+      </w:pPr>
+      <w:rPr>
+        <w:rFonts w:ascii="Wingdings" w:hAnsi="Wingdings" w:hint="default"/>
+        <w:sz w:val="20"/>
+      </w:rPr>
+    </w:lvl>
+  </w:abstractNum>
+  <w:abstractNum w:abstractNumId="10" w15:restartNumberingAfterBreak="0">
+    <w:nsid w:val="68623EAA"/>
+    <w:multiLevelType w:val="hybridMultilevel"/>
+    <w:tmpl w:val="8826B6DA"/>
+    <w:lvl w:ilvl="0" w:tplc="40090001">
+      <w:start w:val="1"/>
+      <w:numFmt w:val="bullet"/>
+      <w:lvlText w:val=""/>
+      <w:lvlJc w:val="left"/>
+      <w:pPr>
+        <w:ind w:left="720" w:hanging="360"/>
+      </w:pPr>
+      <w:rPr>
+        <w:rFonts w:ascii="Symbol" w:hAnsi="Symbol" w:hint="default"/>
+      </w:rPr>
+    </w:lvl>
+    <w:lvl w:ilvl="1" w:tplc="40090003" w:tentative="1">
+      <w:start w:val="1"/>
+      <w:numFmt w:val="bullet"/>
+      <w:lvlText w:val="o"/>
+      <w:lvlJc w:val="left"/>
+      <w:pPr>
+        <w:ind w:left="1440" w:hanging="360"/>
+      </w:pPr>
+      <w:rPr>
+        <w:rFonts w:ascii="Courier New" w:hAnsi="Courier New" w:cs="Courier New" w:hint="default"/>
+      </w:rPr>
+    </w:lvl>
+    <w:lvl w:ilvl="2" w:tplc="40090005" w:tentative="1">
+      <w:start w:val="1"/>
+      <w:numFmt w:val="bullet"/>
+      <w:lvlText w:val=""/>
+      <w:lvlJc w:val="left"/>
+      <w:pPr>
+        <w:ind w:left="2160" w:hanging="360"/>
+      </w:pPr>
+      <w:rPr>
+        <w:rFonts w:ascii="Wingdings" w:hAnsi="Wingdings" w:hint="default"/>
+      </w:rPr>
+    </w:lvl>
+    <w:lvl w:ilvl="3" w:tplc="40090001" w:tentative="1">
+      <w:start w:val="1"/>
+      <w:numFmt w:val="bullet"/>
+      <w:lvlText w:val=""/>
+      <w:lvlJc w:val="left"/>
+      <w:pPr>
+        <w:ind w:left="2880" w:hanging="360"/>
+      </w:pPr>
+      <w:rPr>
+        <w:rFonts w:ascii="Symbol" w:hAnsi="Symbol" w:hint="default"/>
+      </w:rPr>
+    </w:lvl>
+    <w:lvl w:ilvl="4" w:tplc="40090003" w:tentative="1">
+      <w:start w:val="1"/>
+      <w:numFmt w:val="bullet"/>
+      <w:lvlText w:val="o"/>
+      <w:lvlJc w:val="left"/>
+      <w:pPr>
+        <w:ind w:left="3600" w:hanging="360"/>
+      </w:pPr>
+      <w:rPr>
+        <w:rFonts w:ascii="Courier New" w:hAnsi="Courier New" w:cs="Courier New" w:hint="default"/>
+      </w:rPr>
+    </w:lvl>
+    <w:lvl w:ilvl="5" w:tplc="40090005" w:tentative="1">
+      <w:start w:val="1"/>
+      <w:numFmt w:val="bullet"/>
+      <w:lvlText w:val=""/>
+      <w:lvlJc w:val="left"/>
+      <w:pPr>
+        <w:ind w:left="4320" w:hanging="360"/>
+      </w:pPr>
+      <w:rPr>
+        <w:rFonts w:ascii="Wingdings" w:hAnsi="Wingdings" w:hint="default"/>
+      </w:rPr>
+    </w:lvl>
+    <w:lvl w:ilvl="6" w:tplc="40090001" w:tentative="1">
+      <w:start w:val="1"/>
+      <w:numFmt w:val="bullet"/>
+      <w:lvlText w:val=""/>
+      <w:lvlJc w:val="left"/>
+      <w:pPr>
+        <w:ind w:left="5040" w:hanging="360"/>
+      </w:pPr>
+      <w:rPr>
+        <w:rFonts w:ascii="Symbol" w:hAnsi="Symbol" w:hint="default"/>
+      </w:rPr>
+    </w:lvl>
+    <w:lvl w:ilvl="7" w:tplc="40090003" w:tentative="1">
+      <w:start w:val="1"/>
+      <w:numFmt w:val="bullet"/>
+      <w:lvlText w:val="o"/>
+      <w:lvlJc w:val="left"/>
+      <w:pPr>
+        <w:ind w:left="5760" w:hanging="360"/>
+      </w:pPr>
+      <w:rPr>
+        <w:rFonts w:ascii="Courier New" w:hAnsi="Courier New" w:cs="Courier New" w:hint="default"/>
+      </w:rPr>
+    </w:lvl>
+    <w:lvl w:ilvl="8" w:tplc="40090005" w:tentative="1">
+      <w:start w:val="1"/>
+      <w:numFmt w:val="bullet"/>
+      <w:lvlText w:val=""/>
+      <w:lvlJc w:val="left"/>
+      <w:pPr>
+        <w:ind w:left="6480" w:hanging="360"/>
+      </w:pPr>
+      <w:rPr>
+        <w:rFonts w:ascii="Wingdings" w:hAnsi="Wingdings" w:hint="default"/>
+      </w:rPr>
+    </w:lvl>
+  </w:abstractNum>
+  <w:abstractNum w:abstractNumId="11" w15:restartNumberingAfterBreak="0">
     <w:nsid w:val="6ADF2EEB"/>
     <w:multiLevelType w:val="hybridMultilevel"/>
     <w:tmpl w:val="4626A784"/>
@@ -1811,7 +2882,7 @@
       </w:rPr>
     </w:lvl>
   </w:abstractNum>
-  <w:abstractNum w:abstractNumId="5" w15:restartNumberingAfterBreak="0">
+  <w:abstractNum w:abstractNumId="12" w15:restartNumberingAfterBreak="0">
     <w:nsid w:val="74FC3DB0"/>
     <w:multiLevelType w:val="hybridMultilevel"/>
     <w:tmpl w:val="852670FE"/>
@@ -1924,7 +2995,156 @@
       </w:rPr>
     </w:lvl>
   </w:abstractNum>
-  <w:abstractNum w:abstractNumId="6" w15:restartNumberingAfterBreak="0">
+  <w:abstractNum w:abstractNumId="13" w15:restartNumberingAfterBreak="0">
+    <w:nsid w:val="7E3F060E"/>
+    <w:multiLevelType w:val="multilevel"/>
+    <w:tmpl w:val="09A2011E"/>
+    <w:lvl w:ilvl="0">
+      <w:start w:val="1"/>
+      <w:numFmt w:val="bullet"/>
+      <w:lvlText w:val=""/>
+      <w:lvlJc w:val="left"/>
+      <w:pPr>
+        <w:tabs>
+          <w:tab w:val="num" w:pos="720"/>
+        </w:tabs>
+        <w:ind w:left="720" w:hanging="360"/>
+      </w:pPr>
+      <w:rPr>
+        <w:rFonts w:ascii="Symbol" w:hAnsi="Symbol" w:hint="default"/>
+        <w:sz w:val="20"/>
+      </w:rPr>
+    </w:lvl>
+    <w:lvl w:ilvl="1" w:tentative="1">
+      <w:start w:val="1"/>
+      <w:numFmt w:val="bullet"/>
+      <w:lvlText w:val="o"/>
+      <w:lvlJc w:val="left"/>
+      <w:pPr>
+        <w:tabs>
+          <w:tab w:val="num" w:pos="1440"/>
+        </w:tabs>
+        <w:ind w:left="1440" w:hanging="360"/>
+      </w:pPr>
+      <w:rPr>
+        <w:rFonts w:ascii="Courier New" w:hAnsi="Courier New" w:hint="default"/>
+        <w:sz w:val="20"/>
+      </w:rPr>
+    </w:lvl>
+    <w:lvl w:ilvl="2" w:tentative="1">
+      <w:start w:val="1"/>
+      <w:numFmt w:val="bullet"/>
+      <w:lvlText w:val=""/>
+      <w:lvlJc w:val="left"/>
+      <w:pPr>
+        <w:tabs>
+          <w:tab w:val="num" w:pos="2160"/>
+        </w:tabs>
+        <w:ind w:left="2160" w:hanging="360"/>
+      </w:pPr>
+      <w:rPr>
+        <w:rFonts w:ascii="Wingdings" w:hAnsi="Wingdings" w:hint="default"/>
+        <w:sz w:val="20"/>
+      </w:rPr>
+    </w:lvl>
+    <w:lvl w:ilvl="3" w:tentative="1">
+      <w:start w:val="1"/>
+      <w:numFmt w:val="bullet"/>
+      <w:lvlText w:val=""/>
+      <w:lvlJc w:val="left"/>
+      <w:pPr>
+        <w:tabs>
+          <w:tab w:val="num" w:pos="2880"/>
+        </w:tabs>
+        <w:ind w:left="2880" w:hanging="360"/>
+      </w:pPr>
+      <w:rPr>
+        <w:rFonts w:ascii="Wingdings" w:hAnsi="Wingdings" w:hint="default"/>
+        <w:sz w:val="20"/>
+      </w:rPr>
+    </w:lvl>
+    <w:lvl w:ilvl="4" w:tentative="1">
+      <w:start w:val="1"/>
+      <w:numFmt w:val="bullet"/>
+      <w:lvlText w:val=""/>
+      <w:lvlJc w:val="left"/>
+      <w:pPr>
+        <w:tabs>
+          <w:tab w:val="num" w:pos="3600"/>
+        </w:tabs>
+        <w:ind w:left="3600" w:hanging="360"/>
+      </w:pPr>
+      <w:rPr>
+        <w:rFonts w:ascii="Wingdings" w:hAnsi="Wingdings" w:hint="default"/>
+        <w:sz w:val="20"/>
+      </w:rPr>
+    </w:lvl>
+    <w:lvl w:ilvl="5" w:tentative="1">
+      <w:start w:val="1"/>
+      <w:numFmt w:val="bullet"/>
+      <w:lvlText w:val=""/>
+      <w:lvlJc w:val="left"/>
+      <w:pPr>
+        <w:tabs>
+          <w:tab w:val="num" w:pos="4320"/>
+        </w:tabs>
+        <w:ind w:left="4320" w:hanging="360"/>
+      </w:pPr>
+      <w:rPr>
+        <w:rFonts w:ascii="Wingdings" w:hAnsi="Wingdings" w:hint="default"/>
+        <w:sz w:val="20"/>
+      </w:rPr>
+    </w:lvl>
+    <w:lvl w:ilvl="6" w:tentative="1">
+      <w:start w:val="1"/>
+      <w:numFmt w:val="bullet"/>
+      <w:lvlText w:val=""/>
+      <w:lvlJc w:val="left"/>
+      <w:pPr>
+        <w:tabs>
+          <w:tab w:val="num" w:pos="5040"/>
+        </w:tabs>
+        <w:ind w:left="5040" w:hanging="360"/>
+      </w:pPr>
+      <w:rPr>
+        <w:rFonts w:ascii="Wingdings" w:hAnsi="Wingdings" w:hint="default"/>
+        <w:sz w:val="20"/>
+      </w:rPr>
+    </w:lvl>
+    <w:lvl w:ilvl="7" w:tentative="1">
+      <w:start w:val="1"/>
+      <w:numFmt w:val="bullet"/>
+      <w:lvlText w:val=""/>
+      <w:lvlJc w:val="left"/>
+      <w:pPr>
+        <w:tabs>
+          <w:tab w:val="num" w:pos="5760"/>
+        </w:tabs>
+        <w:ind w:left="5760" w:hanging="360"/>
+      </w:pPr>
+      <w:rPr>
+        <w:rFonts w:ascii="Wingdings" w:hAnsi="Wingdings" w:hint="default"/>
+        <w:sz w:val="20"/>
+      </w:rPr>
+    </w:lvl>
+    <w:lvl w:ilvl="8" w:tentative="1">
+      <w:start w:val="1"/>
+      <w:numFmt w:val="bullet"/>
+      <w:lvlText w:val=""/>
+      <w:lvlJc w:val="left"/>
+      <w:pPr>
+        <w:tabs>
+          <w:tab w:val="num" w:pos="6480"/>
+        </w:tabs>
+        <w:ind w:left="6480" w:hanging="360"/>
+      </w:pPr>
+      <w:rPr>
+        <w:rFonts w:ascii="Wingdings" w:hAnsi="Wingdings" w:hint="default"/>
+        <w:sz w:val="20"/>
+      </w:rPr>
+    </w:lvl>
+  </w:abstractNum>
+  <w:abstractNum w:abstractNumId="14" w15:restartNumberingAfterBreak="0">
     <w:nsid w:val="7F1B086C"/>
     <w:multiLevelType w:val="hybridMultilevel"/>
     <w:tmpl w:val="A0C2BC6A"/>
@@ -2041,22 +3261,46 @@
     <w:abstractNumId w:val="0"/>
   </w:num>
   <w:num w:numId="2" w16cid:durableId="1214384306">
-    <w:abstractNumId w:val="3"/>
+    <w:abstractNumId w:val="6"/>
   </w:num>
   <w:num w:numId="3" w16cid:durableId="635986109">
-    <w:abstractNumId w:val="5"/>
+    <w:abstractNumId w:val="12"/>
   </w:num>
   <w:num w:numId="4" w16cid:durableId="2052916084">
     <w:abstractNumId w:val="2"/>
   </w:num>
   <w:num w:numId="5" w16cid:durableId="150758519">
-    <w:abstractNumId w:val="6"/>
+    <w:abstractNumId w:val="14"/>
   </w:num>
   <w:num w:numId="6" w16cid:durableId="264458461">
-    <w:abstractNumId w:val="4"/>
+    <w:abstractNumId w:val="11"/>
   </w:num>
   <w:num w:numId="7" w16cid:durableId="1541891453">
     <w:abstractNumId w:val="1"/>
+  </w:num>
+  <w:num w:numId="8" w16cid:durableId="1894849580">
+    <w:abstractNumId w:val="10"/>
+  </w:num>
+  <w:num w:numId="9" w16cid:durableId="1228304066">
+    <w:abstractNumId w:val="5"/>
+  </w:num>
+  <w:num w:numId="10" w16cid:durableId="1785614927">
+    <w:abstractNumId w:val="7"/>
+  </w:num>
+  <w:num w:numId="11" w16cid:durableId="123432915">
+    <w:abstractNumId w:val="4"/>
+  </w:num>
+  <w:num w:numId="12" w16cid:durableId="179246260">
+    <w:abstractNumId w:val="8"/>
+  </w:num>
+  <w:num w:numId="13" w16cid:durableId="755789030">
+    <w:abstractNumId w:val="3"/>
+  </w:num>
+  <w:num w:numId="14" w16cid:durableId="347604620">
+    <w:abstractNumId w:val="13"/>
+  </w:num>
+  <w:num w:numId="15" w16cid:durableId="63526392">
+    <w:abstractNumId w:val="9"/>
   </w:num>
 </w:numbering>
 </file>
@@ -2461,6 +3705,7 @@
   <w:style w:type="paragraph" w:default="1" w:styleId="Normal">
     <w:name w:val="Normal"/>
     <w:qFormat/>
+    <w:rsid w:val="003570DC"/>
   </w:style>
   <w:style w:type="paragraph" w:styleId="Heading1">
     <w:name w:val="heading 1"/>

</xml_diff>